<commit_message>
Added Shubham's paper to Autonomous Robots, updated biv file for ICUAS26 paper and Journal of Intelligent & Robotic Systems
</commit_message>
<xml_diff>
--- a/HowToAddNewPaper.docx
+++ b/HowToAddNewPaper.docx
@@ -1,6 +1,6 @@
 
 <file path=word/document.xml><?xml version="1.0" encoding="utf-8"?>
-<w:document xmlns:wpc="http://schemas.microsoft.com/office/word/2010/wordprocessingCanvas" xmlns:cx="http://schemas.microsoft.com/office/drawing/2014/chartex" xmlns:cx1="http://schemas.microsoft.com/office/drawing/2015/9/8/chartex" xmlns:cx2="http://schemas.microsoft.com/office/drawing/2015/10/21/chartex" xmlns:cx3="http://schemas.microsoft.com/office/drawing/2016/5/9/chartex" xmlns:cx4="http://schemas.microsoft.com/office/drawing/2016/5/10/chartex" xmlns:cx5="http://schemas.microsoft.com/office/drawing/2016/5/11/chartex" xmlns:cx6="http://schemas.microsoft.com/office/drawing/2016/5/12/chartex" xmlns:cx7="http://schemas.microsoft.com/office/drawing/2016/5/13/chartex" xmlns:cx8="http://schemas.microsoft.com/office/drawing/2016/5/14/chartex" xmlns:mc="http://schemas.openxmlformats.org/markup-compatibility/2006" xmlns:m="http://schemas.openxmlformats.org/officeDocument/2006/math" xmlns:aink="http://schemas.microsoft.com/office/drawing/2016/ink" xmlns:am3d="http://schemas.microsoft.com/office/drawing/2017/model3d" xmlns:oel="http://schemas.microsoft.com/office/2019/extlst" xmlns:r="http://schemas.openxmlformats.org/officeDocument/2006/relationships" xmlns:wp14="http://schemas.microsoft.com/office/word/2010/wordprocessingDrawing" xmlns:wp="http://schemas.openxmlformats.org/drawingml/2006/wordprocessingDrawing" xmlns:wpg="http://schemas.microsoft.com/office/word/2010/wordprocessingGroup" xmlns:wpi="http://schemas.microsoft.com/office/word/2010/wordprocessingInk" xmlns:wps="http://schemas.microsoft.com/office/word/2010/wordprocessingShape" xmlns:o="urn:schemas-microsoft-com:office:office" xmlns:v="urn:schemas-microsoft-com:vml" xmlns:w10="urn:schemas-microsoft-com:office:word" xmlns:w="http://schemas.openxmlformats.org/wordprocessingml/2006/main" xmlns:w14="http://schemas.microsoft.com/office/word/2010/wordml" xmlns:w15="http://schemas.microsoft.com/office/word/2012/wordml" xmlns:w16cei="http://schemas.microsoft.com/office/word/2026/wordml/cei" xmlns:w16cex="http://schemas.microsoft.com/office/word/2018/wordml/cex" xmlns:w16cid="http://schemas.microsoft.com/office/word/2016/wordml/cid" xmlns:w16="http://schemas.microsoft.com/office/word/2018/wordml" xmlns:w16sdtdh="http://schemas.microsoft.com/office/word/2020/wordml/sdtdatahash" xmlns:w16sdtfl="http://schemas.microsoft.com/office/word/2024/wordml/sdtformatlock" xmlns:w16se="http://schemas.microsoft.com/office/word/2015/wordml/symex" xmlns:w16du="http://schemas.microsoft.com/office/word/2023/wordml/word16du" xmlns:wne="http://schemas.microsoft.com/office/word/2006/wordml" mc:Ignorable="w14 w15 w16se w16cid w16 w16cex w16sdtdh w16sdtfl w16du wp14">
+<w:document xmlns:wpc="http://schemas.microsoft.com/office/word/2010/wordprocessingCanvas" xmlns:cx="http://schemas.microsoft.com/office/drawing/2014/chartex" xmlns:cx1="http://schemas.microsoft.com/office/drawing/2015/9/8/chartex" xmlns:cx2="http://schemas.microsoft.com/office/drawing/2015/10/21/chartex" xmlns:cx3="http://schemas.microsoft.com/office/drawing/2016/5/9/chartex" xmlns:cx4="http://schemas.microsoft.com/office/drawing/2016/5/10/chartex" xmlns:cx5="http://schemas.microsoft.com/office/drawing/2016/5/11/chartex" xmlns:cx6="http://schemas.microsoft.com/office/drawing/2016/5/12/chartex" xmlns:cx7="http://schemas.microsoft.com/office/drawing/2016/5/13/chartex" xmlns:cx8="http://schemas.microsoft.com/office/drawing/2016/5/14/chartex" xmlns:mc="http://schemas.openxmlformats.org/markup-compatibility/2006" xmlns:m="http://schemas.openxmlformats.org/officeDocument/2006/math" xmlns:aink="http://schemas.microsoft.com/office/drawing/2016/ink" xmlns:am3d="http://schemas.microsoft.com/office/drawing/2017/model3d" xmlns:oel="http://schemas.microsoft.com/office/2019/extlst" xmlns:r="http://schemas.openxmlformats.org/officeDocument/2006/relationships" xmlns:wp14="http://schemas.microsoft.com/office/word/2010/wordprocessingDrawing" xmlns:wp="http://schemas.openxmlformats.org/drawingml/2006/wordprocessingDrawing" xmlns:wpg="http://schemas.microsoft.com/office/word/2010/wordprocessingGroup" xmlns:wpi="http://schemas.microsoft.com/office/word/2010/wordprocessingInk" xmlns:wps="http://schemas.microsoft.com/office/word/2010/wordprocessingShape" xmlns:o="urn:schemas-microsoft-com:office:office" xmlns:v="urn:schemas-microsoft-com:vml" xmlns:w10="urn:schemas-microsoft-com:office:word" xmlns:w="http://schemas.openxmlformats.org/wordprocessingml/2006/main" xmlns:w14="http://schemas.microsoft.com/office/word/2010/wordml" xmlns:w15="http://schemas.microsoft.com/office/word/2012/wordml" xmlns:w16cex="http://schemas.microsoft.com/office/word/2018/wordml/cex" xmlns:w16cid="http://schemas.microsoft.com/office/word/2016/wordml/cid" xmlns:w16="http://schemas.microsoft.com/office/word/2018/wordml" xmlns:w16sdtdh="http://schemas.microsoft.com/office/word/2020/wordml/sdtdatahash" xmlns:w16sdtfl="http://schemas.microsoft.com/office/word/2024/wordml/sdtformatlock" xmlns:w16se="http://schemas.microsoft.com/office/word/2015/wordml/symex" xmlns:w16du="http://schemas.microsoft.com/office/word/2023/wordml/word16du" xmlns:wne="http://schemas.microsoft.com/office/word/2006/wordml" mc:Ignorable="w14 w15 w16se w16cid w16 w16cex w16sdtdh w16sdtfl w16du wp14">
   <w:body>
     <w:p>
       <w:pPr>
@@ -899,133 +899,6 @@
     </w:p>
     <w:p>
       <w:pPr>
-        <w:spacing w:before="100" w:beforeAutospacing="1" w:after="100" w:afterAutospacing="1" w:line="240" w:lineRule="auto"/>
-        <w:outlineLvl w:val="2"/>
-        <w:rPr>
-          <w:rFonts w:ascii="Times New Roman" w:eastAsia="Times New Roman" w:hAnsi="Times New Roman" w:cs="Times New Roman"/>
-          <w:b/>
-          <w:bCs/>
-          <w:color w:val="000000"/>
-          <w:kern w:val="0"/>
-          <w:sz w:val="27"/>
-          <w:szCs w:val="27"/>
-          <w14:ligatures w14:val="none"/>
-        </w:rPr>
-      </w:pPr>
-      <w:r>
-        <w:rPr>
-          <w:rFonts w:ascii="Times New Roman" w:eastAsia="Times New Roman" w:hAnsi="Times New Roman" w:cs="Times New Roman"/>
-          <w:b/>
-          <w:bCs/>
-          <w:color w:val="000000"/>
-          <w:kern w:val="0"/>
-          <w:sz w:val="27"/>
-          <w:szCs w:val="27"/>
-          <w14:ligatures w14:val="none"/>
-        </w:rPr>
-        <w:t>Step 4: Add </w:t>
-      </w:r>
-      <w:r>
-        <w:rPr>
-          <w:rFonts w:ascii="Courier New" w:eastAsia="Times New Roman" w:hAnsi="Courier New" w:cs="Courier New"/>
-          <w:b/>
-          <w:bCs/>
-          <w:color w:val="000000"/>
-          <w:kern w:val="0"/>
-          <w:sz w:val="20"/>
-          <w:szCs w:val="20"/>
-          <w14:ligatures w14:val="none"/>
-        </w:rPr>
-        <w:t>index.md</w:t>
-      </w:r>
-    </w:p>
-    <w:p>
-      <w:pPr>
-        <w:spacing w:before="100" w:beforeAutospacing="1" w:after="100" w:afterAutospacing="1" w:line="240" w:lineRule="auto"/>
-        <w:rPr>
-          <w:rFonts w:ascii="Times New Roman" w:eastAsia="Times New Roman" w:hAnsi="Times New Roman" w:cs="Times New Roman"/>
-          <w:color w:val="000000"/>
-          <w:kern w:val="0"/>
-          <w14:ligatures w14:val="none"/>
-        </w:rPr>
-      </w:pPr>
-      <w:r>
-        <w:rPr>
-          <w:rFonts w:ascii="Times New Roman" w:eastAsia="Times New Roman" w:hAnsi="Times New Roman" w:cs="Times New Roman"/>
-          <w:color w:val="000000"/>
-          <w:kern w:val="0"/>
-          <w14:ligatures w14:val="none"/>
-        </w:rPr>
-        <w:t>In the same folder, create a file named </w:t>
-      </w:r>
-      <w:r>
-        <w:rPr>
-          <w:rFonts w:ascii="Courier New" w:eastAsia="Times New Roman" w:hAnsi="Courier New" w:cs="Courier New"/>
-          <w:color w:val="000000"/>
-          <w:kern w:val="0"/>
-          <w:sz w:val="20"/>
-          <w:szCs w:val="20"/>
-          <w14:ligatures w14:val="none"/>
-        </w:rPr>
-        <w:t>index.md</w:t>
-      </w:r>
-      <w:r>
-        <w:rPr>
-          <w:rFonts w:ascii="Times New Roman" w:eastAsia="Times New Roman" w:hAnsi="Times New Roman" w:cs="Times New Roman"/>
-          <w:color w:val="000000"/>
-          <w:kern w:val="0"/>
-          <w14:ligatures w14:val="none"/>
-        </w:rPr>
-        <w:t> and use the template below</w:t>
-      </w:r>
-      <w:r>
-        <w:rPr>
-          <w:rFonts w:ascii="Times New Roman" w:eastAsia="Times New Roman" w:hAnsi="Times New Roman" w:cs="Times New Roman"/>
-          <w:color w:val="000000"/>
-          <w:kern w:val="0"/>
-          <w14:ligatures w14:val="none"/>
-        </w:rPr>
-        <w:t xml:space="preserve"> </w:t>
-      </w:r>
-      <w:r>
-        <w:rPr>
-          <w:rFonts w:ascii="Times New Roman" w:eastAsia="Times New Roman" w:hAnsi="Times New Roman" w:cs="Times New Roman"/>
-          <w:color w:val="EE0000"/>
-          <w:kern w:val="0"/>
-          <w14:ligatures w14:val="none"/>
-        </w:rPr>
-        <w:t>(or from a previous one)</w:t>
-      </w:r>
-      <w:r>
-        <w:rPr>
-          <w:rFonts w:ascii="Times New Roman" w:eastAsia="Times New Roman" w:hAnsi="Times New Roman" w:cs="Times New Roman"/>
-          <w:color w:val="EE0000"/>
-          <w:kern w:val="0"/>
-          <w14:ligatures w14:val="none"/>
-        </w:rPr>
-        <w:t>:</w:t>
-      </w:r>
-    </w:p>
-    <w:p>
-      <w:pPr>
-        <w:spacing w:after="0" w:line="240" w:lineRule="auto"/>
-        <w:rPr>
-          <w:rFonts w:ascii="Times New Roman" w:eastAsia="Times New Roman" w:hAnsi="Times New Roman" w:cs="Times New Roman"/>
-          <w:kern w:val="0"/>
-          <w14:ligatures w14:val="none"/>
-        </w:rPr>
-      </w:pPr>
-      <w:r>
-        <w:rPr>
-          <w:rFonts w:ascii="Times New Roman" w:eastAsia="Times New Roman" w:hAnsi="Times New Roman" w:cs="Times New Roman"/>
-          <w:kern w:val="0"/>
-          <w14:ligatures w14:val="none"/>
-        </w:rPr>
-        <w:t>YAML</w:t>
-      </w:r>
-    </w:p>
-    <w:p>
-      <w:pPr>
         <w:tabs>
           <w:tab w:val="left" w:pos="916"/>
           <w:tab w:val="left" w:pos="1832"/>
@@ -1053,16 +926,6 @@
           <w14:ligatures w14:val="none"/>
         </w:rPr>
       </w:pPr>
-      <w:r>
-        <w:rPr>
-          <w:rFonts w:ascii="Courier New" w:eastAsia="Times New Roman" w:hAnsi="Courier New" w:cs="Courier New"/>
-          <w:kern w:val="0"/>
-          <w:sz w:val="20"/>
-          <w:szCs w:val="20"/>
-          <w14:ligatures w14:val="none"/>
-        </w:rPr>
-        <w:t>---</w:t>
-      </w:r>
     </w:p>
     <w:p>
       <w:pPr>
@@ -1101,7 +964,29 @@
           <w:szCs w:val="20"/>
           <w14:ligatures w14:val="none"/>
         </w:rPr>
-        <w:t>title: "Advanced EMG Control in Mobile Robotics"</w:t>
+        <w:t>@</w:t>
+      </w:r>
+      <w:proofErr w:type="gramStart"/>
+      <w:r>
+        <w:rPr>
+          <w:rFonts w:ascii="Courier New" w:eastAsia="Times New Roman" w:hAnsi="Courier New" w:cs="Courier New"/>
+          <w:kern w:val="0"/>
+          <w:sz w:val="20"/>
+          <w:szCs w:val="20"/>
+          <w14:ligatures w14:val="none"/>
+        </w:rPr>
+        <w:t>inproceedings{</w:t>
+      </w:r>
+      <w:proofErr w:type="gramEnd"/>
+      <w:r>
+        <w:rPr>
+          <w:rFonts w:ascii="Courier New" w:eastAsia="Times New Roman" w:hAnsi="Courier New" w:cs="Courier New"/>
+          <w:kern w:val="0"/>
+          <w:sz w:val="20"/>
+          <w:szCs w:val="20"/>
+          <w14:ligatures w14:val="none"/>
+        </w:rPr>
+        <w:t>orozco2026human,</w:t>
       </w:r>
     </w:p>
     <w:p>
@@ -1141,7 +1026,7 @@
           <w:szCs w:val="20"/>
           <w14:ligatures w14:val="none"/>
         </w:rPr>
-        <w:t>authors:</w:t>
+        <w:t xml:space="preserve"> address = {Corfu, Greece},</w:t>
       </w:r>
     </w:p>
     <w:p>
@@ -1181,7 +1066,7 @@
           <w:szCs w:val="20"/>
           <w14:ligatures w14:val="none"/>
         </w:rPr>
-        <w:t xml:space="preserve">  - John Smith</w:t>
+        <w:t xml:space="preserve"> author = {Orozco, Jesus and Walsh, Coleman and Artemiadis, Panagiotis},</w:t>
       </w:r>
     </w:p>
     <w:p>
@@ -1221,7 +1106,29 @@
           <w:szCs w:val="20"/>
           <w14:ligatures w14:val="none"/>
         </w:rPr>
-        <w:t xml:space="preserve">  - Panagiotis Artemiadis</w:t>
+        <w:t xml:space="preserve"> </w:t>
+      </w:r>
+      <w:proofErr w:type="spellStart"/>
+      <w:r>
+        <w:rPr>
+          <w:rFonts w:ascii="Courier New" w:eastAsia="Times New Roman" w:hAnsi="Courier New" w:cs="Courier New"/>
+          <w:kern w:val="0"/>
+          <w:sz w:val="20"/>
+          <w:szCs w:val="20"/>
+          <w14:ligatures w14:val="none"/>
+        </w:rPr>
+        <w:t>booktitle</w:t>
+      </w:r>
+      <w:proofErr w:type="spellEnd"/>
+      <w:r>
+        <w:rPr>
+          <w:rFonts w:ascii="Courier New" w:eastAsia="Times New Roman" w:hAnsi="Courier New" w:cs="Courier New"/>
+          <w:kern w:val="0"/>
+          <w:sz w:val="20"/>
+          <w:szCs w:val="20"/>
+          <w14:ligatures w14:val="none"/>
+        </w:rPr>
+        <w:t xml:space="preserve"> = {2026 International Conference on Unmanned Aircraft Systems (ICUAS)},</w:t>
       </w:r>
     </w:p>
     <w:p>
@@ -1253,6 +1160,16 @@
           <w14:ligatures w14:val="none"/>
         </w:rPr>
       </w:pPr>
+      <w:r>
+        <w:rPr>
+          <w:rFonts w:ascii="Courier New" w:eastAsia="Times New Roman" w:hAnsi="Courier New" w:cs="Courier New"/>
+          <w:kern w:val="0"/>
+          <w:sz w:val="20"/>
+          <w:szCs w:val="20"/>
+          <w14:ligatures w14:val="none"/>
+        </w:rPr>
+        <w:t xml:space="preserve"> title = {Human Trust-Driven Adaptive Control for Unmanned Aerial Swarms},</w:t>
+      </w:r>
     </w:p>
     <w:p>
       <w:pPr>
@@ -1291,7 +1208,29 @@
           <w:szCs w:val="20"/>
           <w14:ligatures w14:val="none"/>
         </w:rPr>
-        <w:t>date: "2026-05-15T00:00:00Z"</w:t>
+        <w:t xml:space="preserve"> </w:t>
+      </w:r>
+      <w:proofErr w:type="spellStart"/>
+      <w:r>
+        <w:rPr>
+          <w:rFonts w:ascii="Courier New" w:eastAsia="Times New Roman" w:hAnsi="Courier New" w:cs="Courier New"/>
+          <w:kern w:val="0"/>
+          <w:sz w:val="20"/>
+          <w:szCs w:val="20"/>
+          <w14:ligatures w14:val="none"/>
+        </w:rPr>
+        <w:t>doi</w:t>
+      </w:r>
+      <w:proofErr w:type="spellEnd"/>
+      <w:r>
+        <w:rPr>
+          <w:rFonts w:ascii="Courier New" w:eastAsia="Times New Roman" w:hAnsi="Courier New" w:cs="Courier New"/>
+          <w:kern w:val="0"/>
+          <w:sz w:val="20"/>
+          <w:szCs w:val="20"/>
+          <w14:ligatures w14:val="none"/>
+        </w:rPr>
+        <w:t>={10.1109/ICUAS69441.2026.11598640},</w:t>
       </w:r>
     </w:p>
     <w:p>
@@ -1323,27 +1262,15 @@
           <w14:ligatures w14:val="none"/>
         </w:rPr>
       </w:pPr>
-      <w:proofErr w:type="spellStart"/>
-      <w:r>
-        <w:rPr>
-          <w:rFonts w:ascii="Courier New" w:eastAsia="Times New Roman" w:hAnsi="Courier New" w:cs="Courier New"/>
-          <w:kern w:val="0"/>
-          <w:sz w:val="20"/>
-          <w:szCs w:val="20"/>
-          <w14:ligatures w14:val="none"/>
-        </w:rPr>
-        <w:t>doi</w:t>
-      </w:r>
-      <w:proofErr w:type="spellEnd"/>
-      <w:r>
-        <w:rPr>
-          <w:rFonts w:ascii="Courier New" w:eastAsia="Times New Roman" w:hAnsi="Courier New" w:cs="Courier New"/>
-          <w:kern w:val="0"/>
-          <w:sz w:val="20"/>
-          <w:szCs w:val="20"/>
-          <w14:ligatures w14:val="none"/>
-        </w:rPr>
-        <w:t>: ""</w:t>
+      <w:r>
+        <w:rPr>
+          <w:rFonts w:ascii="Courier New" w:eastAsia="Times New Roman" w:hAnsi="Courier New" w:cs="Courier New"/>
+          <w:kern w:val="0"/>
+          <w:sz w:val="20"/>
+          <w:szCs w:val="20"/>
+          <w14:ligatures w14:val="none"/>
+        </w:rPr>
+        <w:t xml:space="preserve"> pages = {788-795},</w:t>
       </w:r>
     </w:p>
     <w:p>
@@ -1375,6 +1302,16 @@
           <w14:ligatures w14:val="none"/>
         </w:rPr>
       </w:pPr>
+      <w:r>
+        <w:rPr>
+          <w:rFonts w:ascii="Courier New" w:eastAsia="Times New Roman" w:hAnsi="Courier New" w:cs="Courier New"/>
+          <w:kern w:val="0"/>
+          <w:sz w:val="20"/>
+          <w:szCs w:val="20"/>
+          <w14:ligatures w14:val="none"/>
+        </w:rPr>
+        <w:t xml:space="preserve"> year = {2026}</w:t>
+      </w:r>
     </w:p>
     <w:p>
       <w:pPr>
@@ -1413,7 +1350,7 @@
           <w:szCs w:val="20"/>
           <w14:ligatures w14:val="none"/>
         </w:rPr>
-        <w:t># Publication types:</w:t>
+        <w:t>}</w:t>
       </w:r>
     </w:p>
     <w:p>
@@ -1445,38 +1382,6 @@
           <w14:ligatures w14:val="none"/>
         </w:rPr>
       </w:pPr>
-      <w:r>
-        <w:rPr>
-          <w:rFonts w:ascii="Courier New" w:eastAsia="Times New Roman" w:hAnsi="Courier New" w:cs="Courier New"/>
-          <w:kern w:val="0"/>
-          <w:sz w:val="20"/>
-          <w:szCs w:val="20"/>
-          <w14:ligatures w14:val="none"/>
-        </w:rPr>
-        <w:t># ["paper-conference</w:t>
-      </w:r>
-      <w:proofErr w:type="gramStart"/>
-      <w:r>
-        <w:rPr>
-          <w:rFonts w:ascii="Courier New" w:eastAsia="Times New Roman" w:hAnsi="Courier New" w:cs="Courier New"/>
-          <w:kern w:val="0"/>
-          <w:sz w:val="20"/>
-          <w:szCs w:val="20"/>
-          <w14:ligatures w14:val="none"/>
-        </w:rPr>
-        <w:t>"]  -</w:t>
-      </w:r>
-      <w:proofErr w:type="gramEnd"/>
-      <w:r>
-        <w:rPr>
-          <w:rFonts w:ascii="Courier New" w:eastAsia="Times New Roman" w:hAnsi="Courier New" w:cs="Courier New"/>
-          <w:kern w:val="0"/>
-          <w:sz w:val="20"/>
-          <w:szCs w:val="20"/>
-          <w14:ligatures w14:val="none"/>
-        </w:rPr>
-        <w:t>&gt; Conference paper</w:t>
-      </w:r>
     </w:p>
     <w:p>
       <w:pPr>
@@ -1507,37 +1412,123 @@
           <w14:ligatures w14:val="none"/>
         </w:rPr>
       </w:pPr>
-      <w:r>
-        <w:rPr>
-          <w:rFonts w:ascii="Courier New" w:eastAsia="Times New Roman" w:hAnsi="Courier New" w:cs="Courier New"/>
-          <w:kern w:val="0"/>
-          <w:sz w:val="20"/>
-          <w:szCs w:val="20"/>
-          <w14:ligatures w14:val="none"/>
-        </w:rPr>
-        <w:t># ["article-journal</w:t>
-      </w:r>
-      <w:proofErr w:type="gramStart"/>
-      <w:r>
-        <w:rPr>
-          <w:rFonts w:ascii="Courier New" w:eastAsia="Times New Roman" w:hAnsi="Courier New" w:cs="Courier New"/>
-          <w:kern w:val="0"/>
-          <w:sz w:val="20"/>
-          <w:szCs w:val="20"/>
-          <w14:ligatures w14:val="none"/>
-        </w:rPr>
-        <w:t xml:space="preserve">"]   </w:t>
-      </w:r>
-      <w:proofErr w:type="gramEnd"/>
-      <w:r>
-        <w:rPr>
-          <w:rFonts w:ascii="Courier New" w:eastAsia="Times New Roman" w:hAnsi="Courier New" w:cs="Courier New"/>
-          <w:kern w:val="0"/>
-          <w:sz w:val="20"/>
-          <w:szCs w:val="20"/>
-          <w14:ligatures w14:val="none"/>
-        </w:rPr>
-        <w:t>-&gt; Journal article</w:t>
+    </w:p>
+    <w:p>
+      <w:pPr>
+        <w:spacing w:before="100" w:beforeAutospacing="1" w:after="100" w:afterAutospacing="1" w:line="240" w:lineRule="auto"/>
+        <w:outlineLvl w:val="2"/>
+        <w:rPr>
+          <w:rFonts w:ascii="Times New Roman" w:eastAsia="Times New Roman" w:hAnsi="Times New Roman" w:cs="Times New Roman"/>
+          <w:b/>
+          <w:bCs/>
+          <w:color w:val="000000"/>
+          <w:kern w:val="0"/>
+          <w:sz w:val="27"/>
+          <w:szCs w:val="27"/>
+          <w14:ligatures w14:val="none"/>
+        </w:rPr>
+      </w:pPr>
+      <w:r>
+        <w:rPr>
+          <w:rFonts w:ascii="Times New Roman" w:eastAsia="Times New Roman" w:hAnsi="Times New Roman" w:cs="Times New Roman"/>
+          <w:b/>
+          <w:bCs/>
+          <w:color w:val="000000"/>
+          <w:kern w:val="0"/>
+          <w:sz w:val="27"/>
+          <w:szCs w:val="27"/>
+          <w14:ligatures w14:val="none"/>
+        </w:rPr>
+        <w:t>Step 4: Add </w:t>
+      </w:r>
+      <w:r>
+        <w:rPr>
+          <w:rFonts w:ascii="Courier New" w:eastAsia="Times New Roman" w:hAnsi="Courier New" w:cs="Courier New"/>
+          <w:b/>
+          <w:bCs/>
+          <w:color w:val="000000"/>
+          <w:kern w:val="0"/>
+          <w:sz w:val="20"/>
+          <w:szCs w:val="20"/>
+          <w14:ligatures w14:val="none"/>
+        </w:rPr>
+        <w:t>index.md</w:t>
+      </w:r>
+    </w:p>
+    <w:p>
+      <w:pPr>
+        <w:spacing w:before="100" w:beforeAutospacing="1" w:after="100" w:afterAutospacing="1" w:line="240" w:lineRule="auto"/>
+        <w:rPr>
+          <w:rFonts w:ascii="Times New Roman" w:eastAsia="Times New Roman" w:hAnsi="Times New Roman" w:cs="Times New Roman"/>
+          <w:color w:val="000000"/>
+          <w:kern w:val="0"/>
+          <w14:ligatures w14:val="none"/>
+        </w:rPr>
+      </w:pPr>
+      <w:r>
+        <w:rPr>
+          <w:rFonts w:ascii="Times New Roman" w:eastAsia="Times New Roman" w:hAnsi="Times New Roman" w:cs="Times New Roman"/>
+          <w:color w:val="000000"/>
+          <w:kern w:val="0"/>
+          <w14:ligatures w14:val="none"/>
+        </w:rPr>
+        <w:t>In the same folder, create a file named </w:t>
+      </w:r>
+      <w:r>
+        <w:rPr>
+          <w:rFonts w:ascii="Courier New" w:eastAsia="Times New Roman" w:hAnsi="Courier New" w:cs="Courier New"/>
+          <w:color w:val="000000"/>
+          <w:kern w:val="0"/>
+          <w:sz w:val="20"/>
+          <w:szCs w:val="20"/>
+          <w14:ligatures w14:val="none"/>
+        </w:rPr>
+        <w:t>index.md</w:t>
+      </w:r>
+      <w:r>
+        <w:rPr>
+          <w:rFonts w:ascii="Times New Roman" w:eastAsia="Times New Roman" w:hAnsi="Times New Roman" w:cs="Times New Roman"/>
+          <w:color w:val="000000"/>
+          <w:kern w:val="0"/>
+          <w14:ligatures w14:val="none"/>
+        </w:rPr>
+        <w:t> and use the template below</w:t>
+      </w:r>
+      <w:r>
+        <w:rPr>
+          <w:rFonts w:ascii="Times New Roman" w:eastAsia="Times New Roman" w:hAnsi="Times New Roman" w:cs="Times New Roman"/>
+          <w:color w:val="000000"/>
+          <w:kern w:val="0"/>
+          <w14:ligatures w14:val="none"/>
+        </w:rPr>
+        <w:t xml:space="preserve"> </w:t>
+      </w:r>
+      <w:r>
+        <w:rPr>
+          <w:rFonts w:ascii="Times New Roman" w:eastAsia="Times New Roman" w:hAnsi="Times New Roman" w:cs="Times New Roman"/>
+          <w:color w:val="EE0000"/>
+          <w:kern w:val="0"/>
+          <w14:ligatures w14:val="none"/>
+        </w:rPr>
+        <w:t>(or from a previous one):</w:t>
+      </w:r>
+    </w:p>
+    <w:p>
+      <w:pPr>
+        <w:spacing w:after="0" w:line="240" w:lineRule="auto"/>
+        <w:rPr>
+          <w:rFonts w:ascii="Times New Roman" w:eastAsia="Times New Roman" w:hAnsi="Times New Roman" w:cs="Times New Roman"/>
+          <w:kern w:val="0"/>
+          <w14:ligatures w14:val="none"/>
+        </w:rPr>
+      </w:pPr>
+      <w:r>
+        <w:rPr>
+          <w:rFonts w:ascii="Times New Roman" w:eastAsia="Times New Roman" w:hAnsi="Times New Roman" w:cs="Times New Roman"/>
+          <w:kern w:val="0"/>
+          <w14:ligatures w14:val="none"/>
+        </w:rPr>
+        <w:t>YAML</w:t>
       </w:r>
     </w:p>
     <w:p>
@@ -1577,29 +1568,7 @@
           <w:szCs w:val="20"/>
           <w14:ligatures w14:val="none"/>
         </w:rPr>
-        <w:t># ["abstract</w:t>
-      </w:r>
-      <w:proofErr w:type="gramStart"/>
-      <w:r>
-        <w:rPr>
-          <w:rFonts w:ascii="Courier New" w:eastAsia="Times New Roman" w:hAnsi="Courier New" w:cs="Courier New"/>
-          <w:kern w:val="0"/>
-          <w:sz w:val="20"/>
-          <w:szCs w:val="20"/>
-          <w14:ligatures w14:val="none"/>
-        </w:rPr>
-        <w:t xml:space="preserve">"]   </w:t>
-      </w:r>
-      <w:proofErr w:type="gramEnd"/>
-      <w:r>
-        <w:rPr>
-          <w:rFonts w:ascii="Courier New" w:eastAsia="Times New Roman" w:hAnsi="Courier New" w:cs="Courier New"/>
-          <w:kern w:val="0"/>
-          <w:sz w:val="20"/>
-          <w:szCs w:val="20"/>
-          <w14:ligatures w14:val="none"/>
-        </w:rPr>
-        <w:t xml:space="preserve">       -&gt; Conference abstract</w:t>
+        <w:t>---</w:t>
       </w:r>
     </w:p>
     <w:p>
@@ -1639,29 +1608,7 @@
           <w:szCs w:val="20"/>
           <w14:ligatures w14:val="none"/>
         </w:rPr>
-        <w:t># ["preprint</w:t>
-      </w:r>
-      <w:proofErr w:type="gramStart"/>
-      <w:r>
-        <w:rPr>
-          <w:rFonts w:ascii="Courier New" w:eastAsia="Times New Roman" w:hAnsi="Courier New" w:cs="Courier New"/>
-          <w:kern w:val="0"/>
-          <w:sz w:val="20"/>
-          <w:szCs w:val="20"/>
-          <w14:ligatures w14:val="none"/>
-        </w:rPr>
-        <w:t xml:space="preserve">"]   </w:t>
-      </w:r>
-      <w:proofErr w:type="gramEnd"/>
-      <w:r>
-        <w:rPr>
-          <w:rFonts w:ascii="Courier New" w:eastAsia="Times New Roman" w:hAnsi="Courier New" w:cs="Courier New"/>
-          <w:kern w:val="0"/>
-          <w:sz w:val="20"/>
-          <w:szCs w:val="20"/>
-          <w14:ligatures w14:val="none"/>
-        </w:rPr>
-        <w:t xml:space="preserve">       -&gt; Preprint / Working paper</w:t>
+        <w:t>title: "Advanced EMG Control in Mobile Robotics"</w:t>
       </w:r>
     </w:p>
     <w:p>
@@ -1701,29 +1648,7 @@
           <w:szCs w:val="20"/>
           <w14:ligatures w14:val="none"/>
         </w:rPr>
-        <w:t># ["chapter</w:t>
-      </w:r>
-      <w:proofErr w:type="gramStart"/>
-      <w:r>
-        <w:rPr>
-          <w:rFonts w:ascii="Courier New" w:eastAsia="Times New Roman" w:hAnsi="Courier New" w:cs="Courier New"/>
-          <w:kern w:val="0"/>
-          <w:sz w:val="20"/>
-          <w:szCs w:val="20"/>
-          <w14:ligatures w14:val="none"/>
-        </w:rPr>
-        <w:t xml:space="preserve">"]   </w:t>
-      </w:r>
-      <w:proofErr w:type="gramEnd"/>
-      <w:r>
-        <w:rPr>
-          <w:rFonts w:ascii="Courier New" w:eastAsia="Times New Roman" w:hAnsi="Courier New" w:cs="Courier New"/>
-          <w:kern w:val="0"/>
-          <w:sz w:val="20"/>
-          <w:szCs w:val="20"/>
-          <w14:ligatures w14:val="none"/>
-        </w:rPr>
-        <w:t xml:space="preserve">        -&gt; Book section</w:t>
+        <w:t>authors:</w:t>
       </w:r>
     </w:p>
     <w:p>
@@ -1755,27 +1680,16 @@
           <w14:ligatures w14:val="none"/>
         </w:rPr>
       </w:pPr>
-      <w:proofErr w:type="spellStart"/>
-      <w:r>
-        <w:rPr>
-          <w:rFonts w:ascii="Courier New" w:eastAsia="Times New Roman" w:hAnsi="Courier New" w:cs="Courier New"/>
-          <w:kern w:val="0"/>
-          <w:sz w:val="20"/>
-          <w:szCs w:val="20"/>
-          <w14:ligatures w14:val="none"/>
-        </w:rPr>
-        <w:t>publication_types</w:t>
-      </w:r>
-      <w:proofErr w:type="spellEnd"/>
-      <w:r>
-        <w:rPr>
-          <w:rFonts w:ascii="Courier New" w:eastAsia="Times New Roman" w:hAnsi="Courier New" w:cs="Courier New"/>
-          <w:kern w:val="0"/>
-          <w:sz w:val="20"/>
-          <w:szCs w:val="20"/>
-          <w14:ligatures w14:val="none"/>
-        </w:rPr>
-        <w:t>:</w:t>
+      <w:r>
+        <w:rPr>
+          <w:rFonts w:ascii="Courier New" w:eastAsia="Times New Roman" w:hAnsi="Courier New" w:cs="Courier New"/>
+          <w:kern w:val="0"/>
+          <w:sz w:val="20"/>
+          <w:szCs w:val="20"/>
+          <w14:ligatures w14:val="none"/>
+        </w:rPr>
+        <w:lastRenderedPageBreak/>
+        <w:t xml:space="preserve">  - John Smith</w:t>
       </w:r>
     </w:p>
     <w:p>
@@ -1815,8 +1729,7 @@
           <w:szCs w:val="20"/>
           <w14:ligatures w14:val="none"/>
         </w:rPr>
-        <w:lastRenderedPageBreak/>
-        <w:t xml:space="preserve">  - "paper-conference"</w:t>
+        <w:t xml:space="preserve">  - Panagiotis Artemiadis</w:t>
       </w:r>
     </w:p>
     <w:p>
@@ -1886,7 +1799,7 @@
           <w:szCs w:val="20"/>
           <w14:ligatures w14:val="none"/>
         </w:rPr>
-        <w:t># Publication name / venue</w:t>
+        <w:t>date: "2026-05-15T00:00:00Z"</w:t>
       </w:r>
     </w:p>
     <w:p>
@@ -1918,15 +1831,27 @@
           <w14:ligatures w14:val="none"/>
         </w:rPr>
       </w:pPr>
-      <w:r>
-        <w:rPr>
-          <w:rFonts w:ascii="Courier New" w:eastAsia="Times New Roman" w:hAnsi="Courier New" w:cs="Courier New"/>
-          <w:kern w:val="0"/>
-          <w:sz w:val="20"/>
-          <w:szCs w:val="20"/>
-          <w14:ligatures w14:val="none"/>
-        </w:rPr>
-        <w:t>publication: "IEEE International Conference on Robotics and Automation (ICRA)"</w:t>
+      <w:proofErr w:type="spellStart"/>
+      <w:r>
+        <w:rPr>
+          <w:rFonts w:ascii="Courier New" w:eastAsia="Times New Roman" w:hAnsi="Courier New" w:cs="Courier New"/>
+          <w:kern w:val="0"/>
+          <w:sz w:val="20"/>
+          <w:szCs w:val="20"/>
+          <w14:ligatures w14:val="none"/>
+        </w:rPr>
+        <w:t>doi</w:t>
+      </w:r>
+      <w:proofErr w:type="spellEnd"/>
+      <w:r>
+        <w:rPr>
+          <w:rFonts w:ascii="Courier New" w:eastAsia="Times New Roman" w:hAnsi="Courier New" w:cs="Courier New"/>
+          <w:kern w:val="0"/>
+          <w:sz w:val="20"/>
+          <w:szCs w:val="20"/>
+          <w14:ligatures w14:val="none"/>
+        </w:rPr>
+        <w:t>: ""</w:t>
       </w:r>
     </w:p>
     <w:p>
@@ -1958,28 +1883,6 @@
           <w14:ligatures w14:val="none"/>
         </w:rPr>
       </w:pPr>
-      <w:proofErr w:type="spellStart"/>
-      <w:r>
-        <w:rPr>
-          <w:rFonts w:ascii="Courier New" w:eastAsia="Times New Roman" w:hAnsi="Courier New" w:cs="Courier New"/>
-          <w:kern w:val="0"/>
-          <w:sz w:val="20"/>
-          <w:szCs w:val="20"/>
-          <w14:ligatures w14:val="none"/>
-        </w:rPr>
-        <w:t>publication_short</w:t>
-      </w:r>
-      <w:proofErr w:type="spellEnd"/>
-      <w:r>
-        <w:rPr>
-          <w:rFonts w:ascii="Courier New" w:eastAsia="Times New Roman" w:hAnsi="Courier New" w:cs="Courier New"/>
-          <w:kern w:val="0"/>
-          <w:sz w:val="20"/>
-          <w:szCs w:val="20"/>
-          <w14:ligatures w14:val="none"/>
-        </w:rPr>
-        <w:t>: "ICRA"</w:t>
-      </w:r>
     </w:p>
     <w:p>
       <w:pPr>
@@ -2010,6 +1913,16 @@
           <w14:ligatures w14:val="none"/>
         </w:rPr>
       </w:pPr>
+      <w:r>
+        <w:rPr>
+          <w:rFonts w:ascii="Courier New" w:eastAsia="Times New Roman" w:hAnsi="Courier New" w:cs="Courier New"/>
+          <w:kern w:val="0"/>
+          <w:sz w:val="20"/>
+          <w:szCs w:val="20"/>
+          <w14:ligatures w14:val="none"/>
+        </w:rPr>
+        <w:t># Publication types:</w:t>
+      </w:r>
     </w:p>
     <w:p>
       <w:pPr>
@@ -2048,7 +1961,49 @@
           <w:szCs w:val="20"/>
           <w14:ligatures w14:val="none"/>
         </w:rPr>
-        <w:t>abstract: "Insert the full abstract text here."</w:t>
+        <w:t xml:space="preserve"># </w:t>
+      </w:r>
+      <w:r>
+        <w:rPr>
+          <w:rFonts w:ascii="Courier New" w:eastAsia="Times New Roman" w:hAnsi="Courier New" w:cs="Courier New"/>
+          <w:kern w:val="0"/>
+          <w:sz w:val="20"/>
+          <w:szCs w:val="20"/>
+          <w14:ligatures w14:val="none"/>
+        </w:rPr>
+        <w:t xml:space="preserve">1 </w:t>
+      </w:r>
+      <w:r>
+        <w:rPr>
+          <w:rFonts w:ascii="Courier New" w:eastAsia="Times New Roman" w:hAnsi="Courier New" w:cs="Courier New"/>
+          <w:kern w:val="0"/>
+          <w:sz w:val="20"/>
+          <w:szCs w:val="20"/>
+          <w14:ligatures w14:val="none"/>
+        </w:rPr>
+        <w:t>["paper-conference</w:t>
+      </w:r>
+      <w:proofErr w:type="gramStart"/>
+      <w:r>
+        <w:rPr>
+          <w:rFonts w:ascii="Courier New" w:eastAsia="Times New Roman" w:hAnsi="Courier New" w:cs="Courier New"/>
+          <w:kern w:val="0"/>
+          <w:sz w:val="20"/>
+          <w:szCs w:val="20"/>
+          <w14:ligatures w14:val="none"/>
+        </w:rPr>
+        <w:t>"]  -</w:t>
+      </w:r>
+      <w:proofErr w:type="gramEnd"/>
+      <w:r>
+        <w:rPr>
+          <w:rFonts w:ascii="Courier New" w:eastAsia="Times New Roman" w:hAnsi="Courier New" w:cs="Courier New"/>
+          <w:kern w:val="0"/>
+          <w:sz w:val="20"/>
+          <w:szCs w:val="20"/>
+          <w14:ligatures w14:val="none"/>
+        </w:rPr>
+        <w:t>&gt; Conference paper</w:t>
       </w:r>
     </w:p>
     <w:p>
@@ -2080,6 +2035,58 @@
           <w14:ligatures w14:val="none"/>
         </w:rPr>
       </w:pPr>
+      <w:r>
+        <w:rPr>
+          <w:rFonts w:ascii="Courier New" w:eastAsia="Times New Roman" w:hAnsi="Courier New" w:cs="Courier New"/>
+          <w:kern w:val="0"/>
+          <w:sz w:val="20"/>
+          <w:szCs w:val="20"/>
+          <w14:ligatures w14:val="none"/>
+        </w:rPr>
+        <w:t xml:space="preserve"># </w:t>
+      </w:r>
+      <w:r>
+        <w:rPr>
+          <w:rFonts w:ascii="Courier New" w:eastAsia="Times New Roman" w:hAnsi="Courier New" w:cs="Courier New"/>
+          <w:kern w:val="0"/>
+          <w:sz w:val="20"/>
+          <w:szCs w:val="20"/>
+          <w14:ligatures w14:val="none"/>
+        </w:rPr>
+        <w:t xml:space="preserve">2 </w:t>
+      </w:r>
+      <w:r>
+        <w:rPr>
+          <w:rFonts w:ascii="Courier New" w:eastAsia="Times New Roman" w:hAnsi="Courier New" w:cs="Courier New"/>
+          <w:kern w:val="0"/>
+          <w:sz w:val="20"/>
+          <w:szCs w:val="20"/>
+          <w14:ligatures w14:val="none"/>
+        </w:rPr>
+        <w:t>["article-journal</w:t>
+      </w:r>
+      <w:proofErr w:type="gramStart"/>
+      <w:r>
+        <w:rPr>
+          <w:rFonts w:ascii="Courier New" w:eastAsia="Times New Roman" w:hAnsi="Courier New" w:cs="Courier New"/>
+          <w:kern w:val="0"/>
+          <w:sz w:val="20"/>
+          <w:szCs w:val="20"/>
+          <w14:ligatures w14:val="none"/>
+        </w:rPr>
+        <w:t xml:space="preserve">"]   </w:t>
+      </w:r>
+      <w:proofErr w:type="gramEnd"/>
+      <w:r>
+        <w:rPr>
+          <w:rFonts w:ascii="Courier New" w:eastAsia="Times New Roman" w:hAnsi="Courier New" w:cs="Courier New"/>
+          <w:kern w:val="0"/>
+          <w:sz w:val="20"/>
+          <w:szCs w:val="20"/>
+          <w14:ligatures w14:val="none"/>
+        </w:rPr>
+        <w:t>-&gt; Journal article</w:t>
+      </w:r>
     </w:p>
     <w:p>
       <w:pPr>
@@ -2118,7 +2125,49 @@
           <w:szCs w:val="20"/>
           <w14:ligatures w14:val="none"/>
         </w:rPr>
-        <w:t># Link to the PDF in static/pdf/</w:t>
+        <w:t xml:space="preserve"># </w:t>
+      </w:r>
+      <w:r>
+        <w:rPr>
+          <w:rFonts w:ascii="Courier New" w:eastAsia="Times New Roman" w:hAnsi="Courier New" w:cs="Courier New"/>
+          <w:kern w:val="0"/>
+          <w:sz w:val="20"/>
+          <w:szCs w:val="20"/>
+          <w14:ligatures w14:val="none"/>
+        </w:rPr>
+        <w:t xml:space="preserve">3 </w:t>
+      </w:r>
+      <w:r>
+        <w:rPr>
+          <w:rFonts w:ascii="Courier New" w:eastAsia="Times New Roman" w:hAnsi="Courier New" w:cs="Courier New"/>
+          <w:kern w:val="0"/>
+          <w:sz w:val="20"/>
+          <w:szCs w:val="20"/>
+          <w14:ligatures w14:val="none"/>
+        </w:rPr>
+        <w:t>["abstract</w:t>
+      </w:r>
+      <w:proofErr w:type="gramStart"/>
+      <w:r>
+        <w:rPr>
+          <w:rFonts w:ascii="Courier New" w:eastAsia="Times New Roman" w:hAnsi="Courier New" w:cs="Courier New"/>
+          <w:kern w:val="0"/>
+          <w:sz w:val="20"/>
+          <w:szCs w:val="20"/>
+          <w14:ligatures w14:val="none"/>
+        </w:rPr>
+        <w:t xml:space="preserve">"]   </w:t>
+      </w:r>
+      <w:proofErr w:type="gramEnd"/>
+      <w:r>
+        <w:rPr>
+          <w:rFonts w:ascii="Courier New" w:eastAsia="Times New Roman" w:hAnsi="Courier New" w:cs="Courier New"/>
+          <w:kern w:val="0"/>
+          <w:sz w:val="20"/>
+          <w:szCs w:val="20"/>
+          <w14:ligatures w14:val="none"/>
+        </w:rPr>
+        <w:t xml:space="preserve">       -&gt; Conference abstract</w:t>
       </w:r>
     </w:p>
     <w:p>
@@ -2150,48 +2199,57 @@
           <w14:ligatures w14:val="none"/>
         </w:rPr>
       </w:pPr>
-      <w:proofErr w:type="spellStart"/>
-      <w:r>
-        <w:rPr>
-          <w:rFonts w:ascii="Courier New" w:eastAsia="Times New Roman" w:hAnsi="Courier New" w:cs="Courier New"/>
-          <w:kern w:val="0"/>
-          <w:sz w:val="20"/>
-          <w:szCs w:val="20"/>
-          <w14:ligatures w14:val="none"/>
-        </w:rPr>
-        <w:t>url_pdf</w:t>
-      </w:r>
-      <w:proofErr w:type="spellEnd"/>
-      <w:r>
-        <w:rPr>
-          <w:rFonts w:ascii="Courier New" w:eastAsia="Times New Roman" w:hAnsi="Courier New" w:cs="Courier New"/>
-          <w:kern w:val="0"/>
-          <w:sz w:val="20"/>
-          <w:szCs w:val="20"/>
-          <w14:ligatures w14:val="none"/>
-        </w:rPr>
-        <w:t>: "/pdf/</w:t>
-      </w:r>
-      <w:r>
-        <w:rPr>
-          <w:rFonts w:ascii="Courier New" w:eastAsia="Times New Roman" w:hAnsi="Courier New" w:cs="Courier New"/>
-          <w:kern w:val="0"/>
-          <w:sz w:val="20"/>
-          <w:szCs w:val="20"/>
-          <w:highlight w:val="yellow"/>
-          <w14:ligatures w14:val="none"/>
-        </w:rPr>
-        <w:t>smith-2026-robotics</w:t>
-      </w:r>
-      <w:r>
-        <w:rPr>
-          <w:rFonts w:ascii="Courier New" w:eastAsia="Times New Roman" w:hAnsi="Courier New" w:cs="Courier New"/>
-          <w:kern w:val="0"/>
-          <w:sz w:val="20"/>
-          <w:szCs w:val="20"/>
-          <w14:ligatures w14:val="none"/>
-        </w:rPr>
-        <w:t>.pdf"</w:t>
+      <w:r>
+        <w:rPr>
+          <w:rFonts w:ascii="Courier New" w:eastAsia="Times New Roman" w:hAnsi="Courier New" w:cs="Courier New"/>
+          <w:kern w:val="0"/>
+          <w:sz w:val="20"/>
+          <w:szCs w:val="20"/>
+          <w14:ligatures w14:val="none"/>
+        </w:rPr>
+        <w:t xml:space="preserve"># </w:t>
+      </w:r>
+      <w:r>
+        <w:rPr>
+          <w:rFonts w:ascii="Courier New" w:eastAsia="Times New Roman" w:hAnsi="Courier New" w:cs="Courier New"/>
+          <w:kern w:val="0"/>
+          <w:sz w:val="20"/>
+          <w:szCs w:val="20"/>
+          <w14:ligatures w14:val="none"/>
+        </w:rPr>
+        <w:t xml:space="preserve">4 </w:t>
+      </w:r>
+      <w:r>
+        <w:rPr>
+          <w:rFonts w:ascii="Courier New" w:eastAsia="Times New Roman" w:hAnsi="Courier New" w:cs="Courier New"/>
+          <w:kern w:val="0"/>
+          <w:sz w:val="20"/>
+          <w:szCs w:val="20"/>
+          <w14:ligatures w14:val="none"/>
+        </w:rPr>
+        <w:t>["preprint</w:t>
+      </w:r>
+      <w:proofErr w:type="gramStart"/>
+      <w:r>
+        <w:rPr>
+          <w:rFonts w:ascii="Courier New" w:eastAsia="Times New Roman" w:hAnsi="Courier New" w:cs="Courier New"/>
+          <w:kern w:val="0"/>
+          <w:sz w:val="20"/>
+          <w:szCs w:val="20"/>
+          <w14:ligatures w14:val="none"/>
+        </w:rPr>
+        <w:t xml:space="preserve">"]   </w:t>
+      </w:r>
+      <w:proofErr w:type="gramEnd"/>
+      <w:r>
+        <w:rPr>
+          <w:rFonts w:ascii="Courier New" w:eastAsia="Times New Roman" w:hAnsi="Courier New" w:cs="Courier New"/>
+          <w:kern w:val="0"/>
+          <w:sz w:val="20"/>
+          <w:szCs w:val="20"/>
+          <w14:ligatures w14:val="none"/>
+        </w:rPr>
+        <w:t xml:space="preserve">       -&gt; Preprint / Working paper</w:t>
       </w:r>
     </w:p>
     <w:p>
@@ -2223,6 +2281,58 @@
           <w14:ligatures w14:val="none"/>
         </w:rPr>
       </w:pPr>
+      <w:r>
+        <w:rPr>
+          <w:rFonts w:ascii="Courier New" w:eastAsia="Times New Roman" w:hAnsi="Courier New" w:cs="Courier New"/>
+          <w:kern w:val="0"/>
+          <w:sz w:val="20"/>
+          <w:szCs w:val="20"/>
+          <w14:ligatures w14:val="none"/>
+        </w:rPr>
+        <w:t xml:space="preserve"># </w:t>
+      </w:r>
+      <w:r>
+        <w:rPr>
+          <w:rFonts w:ascii="Courier New" w:eastAsia="Times New Roman" w:hAnsi="Courier New" w:cs="Courier New"/>
+          <w:kern w:val="0"/>
+          <w:sz w:val="20"/>
+          <w:szCs w:val="20"/>
+          <w14:ligatures w14:val="none"/>
+        </w:rPr>
+        <w:t xml:space="preserve">5 </w:t>
+      </w:r>
+      <w:r>
+        <w:rPr>
+          <w:rFonts w:ascii="Courier New" w:eastAsia="Times New Roman" w:hAnsi="Courier New" w:cs="Courier New"/>
+          <w:kern w:val="0"/>
+          <w:sz w:val="20"/>
+          <w:szCs w:val="20"/>
+          <w14:ligatures w14:val="none"/>
+        </w:rPr>
+        <w:t>["chapter</w:t>
+      </w:r>
+      <w:proofErr w:type="gramStart"/>
+      <w:r>
+        <w:rPr>
+          <w:rFonts w:ascii="Courier New" w:eastAsia="Times New Roman" w:hAnsi="Courier New" w:cs="Courier New"/>
+          <w:kern w:val="0"/>
+          <w:sz w:val="20"/>
+          <w:szCs w:val="20"/>
+          <w14:ligatures w14:val="none"/>
+        </w:rPr>
+        <w:t xml:space="preserve">"]   </w:t>
+      </w:r>
+      <w:proofErr w:type="gramEnd"/>
+      <w:r>
+        <w:rPr>
+          <w:rFonts w:ascii="Courier New" w:eastAsia="Times New Roman" w:hAnsi="Courier New" w:cs="Courier New"/>
+          <w:kern w:val="0"/>
+          <w:sz w:val="20"/>
+          <w:szCs w:val="20"/>
+          <w14:ligatures w14:val="none"/>
+        </w:rPr>
+        <w:t xml:space="preserve">        -&gt; Book section</w:t>
+      </w:r>
     </w:p>
     <w:p>
       <w:pPr>
@@ -2253,15 +2363,27 @@
           <w14:ligatures w14:val="none"/>
         </w:rPr>
       </w:pPr>
-      <w:r>
-        <w:rPr>
-          <w:rFonts w:ascii="Courier New" w:eastAsia="Times New Roman" w:hAnsi="Courier New" w:cs="Courier New"/>
-          <w:kern w:val="0"/>
-          <w:sz w:val="20"/>
-          <w:szCs w:val="20"/>
-          <w14:ligatures w14:val="none"/>
-        </w:rPr>
-        <w:t># Optional links</w:t>
+      <w:proofErr w:type="spellStart"/>
+      <w:r>
+        <w:rPr>
+          <w:rFonts w:ascii="Courier New" w:eastAsia="Times New Roman" w:hAnsi="Courier New" w:cs="Courier New"/>
+          <w:kern w:val="0"/>
+          <w:sz w:val="20"/>
+          <w:szCs w:val="20"/>
+          <w14:ligatures w14:val="none"/>
+        </w:rPr>
+        <w:t>publication_types</w:t>
+      </w:r>
+      <w:proofErr w:type="spellEnd"/>
+      <w:r>
+        <w:rPr>
+          <w:rFonts w:ascii="Courier New" w:eastAsia="Times New Roman" w:hAnsi="Courier New" w:cs="Courier New"/>
+          <w:kern w:val="0"/>
+          <w:sz w:val="20"/>
+          <w:szCs w:val="20"/>
+          <w14:ligatures w14:val="none"/>
+        </w:rPr>
+        <w:t>:</w:t>
       </w:r>
     </w:p>
     <w:p>
@@ -2293,27 +2415,25 @@
           <w14:ligatures w14:val="none"/>
         </w:rPr>
       </w:pPr>
-      <w:proofErr w:type="spellStart"/>
-      <w:r>
-        <w:rPr>
-          <w:rFonts w:ascii="Courier New" w:eastAsia="Times New Roman" w:hAnsi="Courier New" w:cs="Courier New"/>
-          <w:kern w:val="0"/>
-          <w:sz w:val="20"/>
-          <w:szCs w:val="20"/>
-          <w14:ligatures w14:val="none"/>
-        </w:rPr>
-        <w:t>url_code</w:t>
-      </w:r>
-      <w:proofErr w:type="spellEnd"/>
-      <w:r>
-        <w:rPr>
-          <w:rFonts w:ascii="Courier New" w:eastAsia="Times New Roman" w:hAnsi="Courier New" w:cs="Courier New"/>
-          <w:kern w:val="0"/>
-          <w:sz w:val="20"/>
-          <w:szCs w:val="20"/>
-          <w14:ligatures w14:val="none"/>
-        </w:rPr>
-        <w:t>: ""</w:t>
+      <w:r>
+        <w:rPr>
+          <w:rFonts w:ascii="Courier New" w:eastAsia="Times New Roman" w:hAnsi="Courier New" w:cs="Courier New"/>
+          <w:kern w:val="0"/>
+          <w:sz w:val="20"/>
+          <w:szCs w:val="20"/>
+          <w14:ligatures w14:val="none"/>
+        </w:rPr>
+        <w:t xml:space="preserve">  - </w:t>
+      </w:r>
+      <w:r>
+        <w:rPr>
+          <w:rFonts w:ascii="Courier New" w:eastAsia="Times New Roman" w:hAnsi="Courier New" w:cs="Courier New"/>
+          <w:kern w:val="0"/>
+          <w:sz w:val="20"/>
+          <w:szCs w:val="20"/>
+          <w14:ligatures w14:val="none"/>
+        </w:rPr>
+        <w:t>‘1’</w:t>
       </w:r>
     </w:p>
     <w:p>
@@ -2345,28 +2465,6 @@
           <w14:ligatures w14:val="none"/>
         </w:rPr>
       </w:pPr>
-      <w:proofErr w:type="spellStart"/>
-      <w:r>
-        <w:rPr>
-          <w:rFonts w:ascii="Courier New" w:eastAsia="Times New Roman" w:hAnsi="Courier New" w:cs="Courier New"/>
-          <w:kern w:val="0"/>
-          <w:sz w:val="20"/>
-          <w:szCs w:val="20"/>
-          <w14:ligatures w14:val="none"/>
-        </w:rPr>
-        <w:t>url_dataset</w:t>
-      </w:r>
-      <w:proofErr w:type="spellEnd"/>
-      <w:r>
-        <w:rPr>
-          <w:rFonts w:ascii="Courier New" w:eastAsia="Times New Roman" w:hAnsi="Courier New" w:cs="Courier New"/>
-          <w:kern w:val="0"/>
-          <w:sz w:val="20"/>
-          <w:szCs w:val="20"/>
-          <w14:ligatures w14:val="none"/>
-        </w:rPr>
-        <w:t>: ""</w:t>
-      </w:r>
     </w:p>
     <w:p>
       <w:pPr>
@@ -2397,27 +2495,15 @@
           <w14:ligatures w14:val="none"/>
         </w:rPr>
       </w:pPr>
-      <w:proofErr w:type="spellStart"/>
-      <w:r>
-        <w:rPr>
-          <w:rFonts w:ascii="Courier New" w:eastAsia="Times New Roman" w:hAnsi="Courier New" w:cs="Courier New"/>
-          <w:kern w:val="0"/>
-          <w:sz w:val="20"/>
-          <w:szCs w:val="20"/>
-          <w14:ligatures w14:val="none"/>
-        </w:rPr>
-        <w:t>url_poster</w:t>
-      </w:r>
-      <w:proofErr w:type="spellEnd"/>
-      <w:r>
-        <w:rPr>
-          <w:rFonts w:ascii="Courier New" w:eastAsia="Times New Roman" w:hAnsi="Courier New" w:cs="Courier New"/>
-          <w:kern w:val="0"/>
-          <w:sz w:val="20"/>
-          <w:szCs w:val="20"/>
-          <w14:ligatures w14:val="none"/>
-        </w:rPr>
-        <w:t>: ""</w:t>
+      <w:r>
+        <w:rPr>
+          <w:rFonts w:ascii="Courier New" w:eastAsia="Times New Roman" w:hAnsi="Courier New" w:cs="Courier New"/>
+          <w:kern w:val="0"/>
+          <w:sz w:val="20"/>
+          <w:szCs w:val="20"/>
+          <w14:ligatures w14:val="none"/>
+        </w:rPr>
+        <w:t># Publication name / venue</w:t>
       </w:r>
     </w:p>
     <w:p>
@@ -2449,27 +2535,15 @@
           <w14:ligatures w14:val="none"/>
         </w:rPr>
       </w:pPr>
-      <w:proofErr w:type="spellStart"/>
-      <w:r>
-        <w:rPr>
-          <w:rFonts w:ascii="Courier New" w:eastAsia="Times New Roman" w:hAnsi="Courier New" w:cs="Courier New"/>
-          <w:kern w:val="0"/>
-          <w:sz w:val="20"/>
-          <w:szCs w:val="20"/>
-          <w14:ligatures w14:val="none"/>
-        </w:rPr>
-        <w:t>url_slides</w:t>
-      </w:r>
-      <w:proofErr w:type="spellEnd"/>
-      <w:r>
-        <w:rPr>
-          <w:rFonts w:ascii="Courier New" w:eastAsia="Times New Roman" w:hAnsi="Courier New" w:cs="Courier New"/>
-          <w:kern w:val="0"/>
-          <w:sz w:val="20"/>
-          <w:szCs w:val="20"/>
-          <w14:ligatures w14:val="none"/>
-        </w:rPr>
-        <w:t>: ""</w:t>
+      <w:r>
+        <w:rPr>
+          <w:rFonts w:ascii="Courier New" w:eastAsia="Times New Roman" w:hAnsi="Courier New" w:cs="Courier New"/>
+          <w:kern w:val="0"/>
+          <w:sz w:val="20"/>
+          <w:szCs w:val="20"/>
+          <w14:ligatures w14:val="none"/>
+        </w:rPr>
+        <w:t>publication: "IEEE International Conference on Robotics and Automation (ICRA)"</w:t>
       </w:r>
     </w:p>
     <w:p>
@@ -2510,7 +2584,7 @@
           <w:szCs w:val="20"/>
           <w14:ligatures w14:val="none"/>
         </w:rPr>
-        <w:t>url_source</w:t>
+        <w:t>publication_short</w:t>
       </w:r>
       <w:proofErr w:type="spellEnd"/>
       <w:r>
@@ -2521,7 +2595,7 @@
           <w:szCs w:val="20"/>
           <w14:ligatures w14:val="none"/>
         </w:rPr>
-        <w:t>: ""</w:t>
+        <w:t>: "ICRA"</w:t>
       </w:r>
     </w:p>
     <w:p>
@@ -2553,28 +2627,6 @@
           <w14:ligatures w14:val="none"/>
         </w:rPr>
       </w:pPr>
-      <w:proofErr w:type="spellStart"/>
-      <w:r>
-        <w:rPr>
-          <w:rFonts w:ascii="Courier New" w:eastAsia="Times New Roman" w:hAnsi="Courier New" w:cs="Courier New"/>
-          <w:kern w:val="0"/>
-          <w:sz w:val="20"/>
-          <w:szCs w:val="20"/>
-          <w14:ligatures w14:val="none"/>
-        </w:rPr>
-        <w:t>url_video</w:t>
-      </w:r>
-      <w:proofErr w:type="spellEnd"/>
-      <w:r>
-        <w:rPr>
-          <w:rFonts w:ascii="Courier New" w:eastAsia="Times New Roman" w:hAnsi="Courier New" w:cs="Courier New"/>
-          <w:kern w:val="0"/>
-          <w:sz w:val="20"/>
-          <w:szCs w:val="20"/>
-          <w14:ligatures w14:val="none"/>
-        </w:rPr>
-        <w:t>: ""</w:t>
-      </w:r>
     </w:p>
     <w:p>
       <w:pPr>
@@ -2605,6 +2657,16 @@
           <w14:ligatures w14:val="none"/>
         </w:rPr>
       </w:pPr>
+      <w:r>
+        <w:rPr>
+          <w:rFonts w:ascii="Courier New" w:eastAsia="Times New Roman" w:hAnsi="Courier New" w:cs="Courier New"/>
+          <w:kern w:val="0"/>
+          <w:sz w:val="20"/>
+          <w:szCs w:val="20"/>
+          <w14:ligatures w14:val="none"/>
+        </w:rPr>
+        <w:t>abstract: "Insert the full abstract text here."</w:t>
+      </w:r>
     </w:p>
     <w:p>
       <w:pPr>
@@ -2635,16 +2697,6 @@
           <w14:ligatures w14:val="none"/>
         </w:rPr>
       </w:pPr>
-      <w:r>
-        <w:rPr>
-          <w:rFonts w:ascii="Courier New" w:eastAsia="Times New Roman" w:hAnsi="Courier New" w:cs="Courier New"/>
-          <w:kern w:val="0"/>
-          <w:sz w:val="20"/>
-          <w:szCs w:val="20"/>
-          <w14:ligatures w14:val="none"/>
-        </w:rPr>
-        <w:t>featured: false</w:t>
-      </w:r>
     </w:p>
     <w:p>
       <w:pPr>
@@ -2683,81 +2735,7 @@
           <w:szCs w:val="20"/>
           <w14:ligatures w14:val="none"/>
         </w:rPr>
-        <w:t>---</w:t>
-      </w:r>
-    </w:p>
-    <w:p>
-      <w:pPr>
-        <w:spacing w:before="100" w:beforeAutospacing="1" w:after="100" w:afterAutospacing="1" w:line="240" w:lineRule="auto"/>
-        <w:outlineLvl w:val="2"/>
-        <w:rPr>
-          <w:rFonts w:ascii="Times New Roman" w:eastAsia="Times New Roman" w:hAnsi="Times New Roman" w:cs="Times New Roman"/>
-          <w:b/>
-          <w:bCs/>
-          <w:color w:val="000000"/>
-          <w:kern w:val="0"/>
-          <w:sz w:val="27"/>
-          <w:szCs w:val="27"/>
-          <w14:ligatures w14:val="none"/>
-        </w:rPr>
-      </w:pPr>
-      <w:r>
-        <w:rPr>
-          <w:rFonts w:ascii="Times New Roman" w:eastAsia="Times New Roman" w:hAnsi="Times New Roman" w:cs="Times New Roman"/>
-          <w:b/>
-          <w:bCs/>
-          <w:color w:val="000000"/>
-          <w:kern w:val="0"/>
-          <w:sz w:val="27"/>
-          <w:szCs w:val="27"/>
-          <w14:ligatures w14:val="none"/>
-        </w:rPr>
-        <w:t>Step 5: Test and Deploy</w:t>
-      </w:r>
-    </w:p>
-    <w:p>
-      <w:pPr>
-        <w:numPr>
-          <w:ilvl w:val="0"/>
-          <w:numId w:val="3"/>
-        </w:numPr>
-        <w:spacing w:before="100" w:beforeAutospacing="1" w:after="100" w:afterAutospacing="1" w:line="240" w:lineRule="auto"/>
-        <w:rPr>
-          <w:rFonts w:ascii="Times New Roman" w:eastAsia="Times New Roman" w:hAnsi="Times New Roman" w:cs="Times New Roman"/>
-          <w:color w:val="000000"/>
-          <w:kern w:val="0"/>
-          <w14:ligatures w14:val="none"/>
-        </w:rPr>
-      </w:pPr>
-      <w:r>
-        <w:rPr>
-          <w:rFonts w:ascii="Times New Roman" w:eastAsia="Times New Roman" w:hAnsi="Times New Roman" w:cs="Times New Roman"/>
-          <w:color w:val="000000"/>
-          <w:kern w:val="0"/>
-          <w14:ligatures w14:val="none"/>
-        </w:rPr>
-        <w:t>Preview your new publication locally:</w:t>
-      </w:r>
-    </w:p>
-    <w:p>
-      <w:pPr>
-        <w:spacing w:beforeAutospacing="1" w:after="0" w:afterAutospacing="1" w:line="240" w:lineRule="auto"/>
-        <w:ind w:left="720"/>
-        <w:rPr>
-          <w:rFonts w:ascii="Times New Roman" w:eastAsia="Times New Roman" w:hAnsi="Times New Roman" w:cs="Times New Roman"/>
-          <w:color w:val="000000"/>
-          <w:kern w:val="0"/>
-          <w14:ligatures w14:val="none"/>
-        </w:rPr>
-      </w:pPr>
-      <w:r>
-        <w:rPr>
-          <w:rFonts w:ascii="Times New Roman" w:eastAsia="Times New Roman" w:hAnsi="Times New Roman" w:cs="Times New Roman"/>
-          <w:color w:val="000000"/>
-          <w:kern w:val="0"/>
-          <w14:ligatures w14:val="none"/>
-        </w:rPr>
-        <w:t>Bash</w:t>
+        <w:t># Link to the PDF in static/pdf/</w:t>
       </w:r>
     </w:p>
     <w:p>
@@ -2781,10 +2759,8 @@
           <w:tab w:val="left" w:pos="14656"/>
         </w:tabs>
         <w:spacing w:after="0" w:line="240" w:lineRule="auto"/>
-        <w:ind w:left="720"/>
-        <w:rPr>
-          <w:rFonts w:ascii="Courier New" w:eastAsia="Times New Roman" w:hAnsi="Courier New" w:cs="Courier New"/>
-          <w:color w:val="000000"/>
+        <w:rPr>
+          <w:rFonts w:ascii="Courier New" w:eastAsia="Times New Roman" w:hAnsi="Courier New" w:cs="Courier New"/>
           <w:kern w:val="0"/>
           <w:sz w:val="20"/>
           <w:szCs w:val="20"/>
@@ -2795,83 +2771,44 @@
       <w:r>
         <w:rPr>
           <w:rFonts w:ascii="Courier New" w:eastAsia="Times New Roman" w:hAnsi="Courier New" w:cs="Courier New"/>
-          <w:color w:val="000000"/>
-          <w:kern w:val="0"/>
-          <w:sz w:val="20"/>
-          <w:szCs w:val="20"/>
-          <w14:ligatures w14:val="none"/>
-        </w:rPr>
-        <w:t>hugo</w:t>
+          <w:kern w:val="0"/>
+          <w:sz w:val="20"/>
+          <w:szCs w:val="20"/>
+          <w14:ligatures w14:val="none"/>
+        </w:rPr>
+        <w:t>url_pdf</w:t>
       </w:r>
       <w:proofErr w:type="spellEnd"/>
       <w:r>
         <w:rPr>
           <w:rFonts w:ascii="Courier New" w:eastAsia="Times New Roman" w:hAnsi="Courier New" w:cs="Courier New"/>
-          <w:color w:val="000000"/>
-          <w:kern w:val="0"/>
-          <w:sz w:val="20"/>
-          <w:szCs w:val="20"/>
-          <w14:ligatures w14:val="none"/>
-        </w:rPr>
-        <w:t xml:space="preserve"> server -D --</w:t>
-      </w:r>
-      <w:proofErr w:type="spellStart"/>
-      <w:r>
-        <w:rPr>
-          <w:rFonts w:ascii="Courier New" w:eastAsia="Times New Roman" w:hAnsi="Courier New" w:cs="Courier New"/>
-          <w:color w:val="000000"/>
-          <w:kern w:val="0"/>
-          <w:sz w:val="20"/>
-          <w:szCs w:val="20"/>
-          <w14:ligatures w14:val="none"/>
-        </w:rPr>
-        <w:t>buildFuture</w:t>
-      </w:r>
-      <w:proofErr w:type="spellEnd"/>
-    </w:p>
-    <w:p>
-      <w:pPr>
-        <w:numPr>
-          <w:ilvl w:val="0"/>
-          <w:numId w:val="3"/>
-        </w:numPr>
-        <w:spacing w:before="100" w:beforeAutospacing="1" w:after="100" w:afterAutospacing="1" w:line="240" w:lineRule="auto"/>
-        <w:rPr>
-          <w:rFonts w:ascii="Times New Roman" w:eastAsia="Times New Roman" w:hAnsi="Times New Roman" w:cs="Times New Roman"/>
-          <w:color w:val="000000"/>
-          <w:kern w:val="0"/>
-          <w14:ligatures w14:val="none"/>
-        </w:rPr>
-      </w:pPr>
-      <w:r>
-        <w:rPr>
-          <w:rFonts w:ascii="Times New Roman" w:eastAsia="Times New Roman" w:hAnsi="Times New Roman" w:cs="Times New Roman"/>
-          <w:color w:val="000000"/>
-          <w:kern w:val="0"/>
-          <w14:ligatures w14:val="none"/>
-        </w:rPr>
-        <w:t>Push the changes to GitHub Pages:</w:t>
-      </w:r>
-    </w:p>
-    <w:p>
-      <w:pPr>
-        <w:spacing w:beforeAutospacing="1" w:after="0" w:afterAutospacing="1" w:line="240" w:lineRule="auto"/>
-        <w:ind w:left="720"/>
-        <w:rPr>
-          <w:rFonts w:ascii="Times New Roman" w:eastAsia="Times New Roman" w:hAnsi="Times New Roman" w:cs="Times New Roman"/>
-          <w:color w:val="000000"/>
-          <w:kern w:val="0"/>
-          <w14:ligatures w14:val="none"/>
-        </w:rPr>
-      </w:pPr>
-      <w:r>
-        <w:rPr>
-          <w:rFonts w:ascii="Times New Roman" w:eastAsia="Times New Roman" w:hAnsi="Times New Roman" w:cs="Times New Roman"/>
-          <w:color w:val="000000"/>
-          <w:kern w:val="0"/>
-          <w14:ligatures w14:val="none"/>
-        </w:rPr>
-        <w:t>Bash</w:t>
+          <w:kern w:val="0"/>
+          <w:sz w:val="20"/>
+          <w:szCs w:val="20"/>
+          <w14:ligatures w14:val="none"/>
+        </w:rPr>
+        <w:t>: "/pdf/</w:t>
+      </w:r>
+      <w:r>
+        <w:rPr>
+          <w:rFonts w:ascii="Courier New" w:eastAsia="Times New Roman" w:hAnsi="Courier New" w:cs="Courier New"/>
+          <w:kern w:val="0"/>
+          <w:sz w:val="20"/>
+          <w:szCs w:val="20"/>
+          <w:highlight w:val="yellow"/>
+          <w14:ligatures w14:val="none"/>
+        </w:rPr>
+        <w:t>smith-2026-robotics</w:t>
+      </w:r>
+      <w:r>
+        <w:rPr>
+          <w:rFonts w:ascii="Courier New" w:eastAsia="Times New Roman" w:hAnsi="Courier New" w:cs="Courier New"/>
+          <w:kern w:val="0"/>
+          <w:sz w:val="20"/>
+          <w:szCs w:val="20"/>
+          <w14:ligatures w14:val="none"/>
+        </w:rPr>
+        <w:t>.pdf"</w:t>
       </w:r>
     </w:p>
     <w:p>
@@ -2895,40 +2832,14 @@
           <w:tab w:val="left" w:pos="14656"/>
         </w:tabs>
         <w:spacing w:after="0" w:line="240" w:lineRule="auto"/>
-        <w:ind w:left="720"/>
-        <w:rPr>
-          <w:rFonts w:ascii="Courier New" w:eastAsia="Times New Roman" w:hAnsi="Courier New" w:cs="Courier New"/>
-          <w:color w:val="000000"/>
-          <w:kern w:val="0"/>
-          <w:sz w:val="20"/>
-          <w:szCs w:val="20"/>
-          <w14:ligatures w14:val="none"/>
-        </w:rPr>
-      </w:pPr>
-      <w:r>
-        <w:rPr>
-          <w:rFonts w:ascii="Courier New" w:eastAsia="Times New Roman" w:hAnsi="Courier New" w:cs="Courier New"/>
-          <w:color w:val="000000"/>
-          <w:kern w:val="0"/>
-          <w:sz w:val="20"/>
-          <w:szCs w:val="20"/>
-          <w14:ligatures w14:val="none"/>
-        </w:rPr>
-        <w:t xml:space="preserve">git </w:t>
-      </w:r>
-      <w:proofErr w:type="gramStart"/>
-      <w:r>
-        <w:rPr>
-          <w:rFonts w:ascii="Courier New" w:eastAsia="Times New Roman" w:hAnsi="Courier New" w:cs="Courier New"/>
-          <w:color w:val="000000"/>
-          <w:kern w:val="0"/>
-          <w:sz w:val="20"/>
-          <w:szCs w:val="20"/>
-          <w14:ligatures w14:val="none"/>
-        </w:rPr>
-        <w:t>add .</w:t>
-      </w:r>
-      <w:proofErr w:type="gramEnd"/>
+        <w:rPr>
+          <w:rFonts w:ascii="Courier New" w:eastAsia="Times New Roman" w:hAnsi="Courier New" w:cs="Courier New"/>
+          <w:kern w:val="0"/>
+          <w:sz w:val="20"/>
+          <w:szCs w:val="20"/>
+          <w14:ligatures w14:val="none"/>
+        </w:rPr>
+      </w:pPr>
     </w:p>
     <w:p>
       <w:pPr>
@@ -2951,26 +2862,23 @@
           <w:tab w:val="left" w:pos="14656"/>
         </w:tabs>
         <w:spacing w:after="0" w:line="240" w:lineRule="auto"/>
-        <w:ind w:left="720"/>
-        <w:rPr>
-          <w:rFonts w:ascii="Courier New" w:eastAsia="Times New Roman" w:hAnsi="Courier New" w:cs="Courier New"/>
-          <w:color w:val="000000"/>
-          <w:kern w:val="0"/>
-          <w:sz w:val="20"/>
-          <w:szCs w:val="20"/>
-          <w14:ligatures w14:val="none"/>
-        </w:rPr>
-      </w:pPr>
-      <w:r>
-        <w:rPr>
-          <w:rFonts w:ascii="Courier New" w:eastAsia="Times New Roman" w:hAnsi="Courier New" w:cs="Courier New"/>
-          <w:color w:val="000000"/>
-          <w:kern w:val="0"/>
-          <w:sz w:val="20"/>
-          <w:szCs w:val="20"/>
-          <w14:ligatures w14:val="none"/>
-        </w:rPr>
-        <w:t>git commit -m "Add new publication: Smith 2026"</w:t>
+        <w:rPr>
+          <w:rFonts w:ascii="Courier New" w:eastAsia="Times New Roman" w:hAnsi="Courier New" w:cs="Courier New"/>
+          <w:kern w:val="0"/>
+          <w:sz w:val="20"/>
+          <w:szCs w:val="20"/>
+          <w14:ligatures w14:val="none"/>
+        </w:rPr>
+      </w:pPr>
+      <w:r>
+        <w:rPr>
+          <w:rFonts w:ascii="Courier New" w:eastAsia="Times New Roman" w:hAnsi="Courier New" w:cs="Courier New"/>
+          <w:kern w:val="0"/>
+          <w:sz w:val="20"/>
+          <w:szCs w:val="20"/>
+          <w14:ligatures w14:val="none"/>
+        </w:rPr>
+        <w:t># Optional links</w:t>
       </w:r>
     </w:p>
     <w:p>
@@ -2994,8 +2902,717 @@
           <w:tab w:val="left" w:pos="14656"/>
         </w:tabs>
         <w:spacing w:after="0" w:line="240" w:lineRule="auto"/>
+        <w:rPr>
+          <w:rFonts w:ascii="Courier New" w:eastAsia="Times New Roman" w:hAnsi="Courier New" w:cs="Courier New"/>
+          <w:kern w:val="0"/>
+          <w:sz w:val="20"/>
+          <w:szCs w:val="20"/>
+          <w14:ligatures w14:val="none"/>
+        </w:rPr>
+      </w:pPr>
+      <w:proofErr w:type="spellStart"/>
+      <w:r>
+        <w:rPr>
+          <w:rFonts w:ascii="Courier New" w:eastAsia="Times New Roman" w:hAnsi="Courier New" w:cs="Courier New"/>
+          <w:kern w:val="0"/>
+          <w:sz w:val="20"/>
+          <w:szCs w:val="20"/>
+          <w14:ligatures w14:val="none"/>
+        </w:rPr>
+        <w:t>url_code</w:t>
+      </w:r>
+      <w:proofErr w:type="spellEnd"/>
+      <w:r>
+        <w:rPr>
+          <w:rFonts w:ascii="Courier New" w:eastAsia="Times New Roman" w:hAnsi="Courier New" w:cs="Courier New"/>
+          <w:kern w:val="0"/>
+          <w:sz w:val="20"/>
+          <w:szCs w:val="20"/>
+          <w14:ligatures w14:val="none"/>
+        </w:rPr>
+        <w:t>: ""</w:t>
+      </w:r>
+    </w:p>
+    <w:p>
+      <w:pPr>
+        <w:tabs>
+          <w:tab w:val="left" w:pos="916"/>
+          <w:tab w:val="left" w:pos="1832"/>
+          <w:tab w:val="left" w:pos="2748"/>
+          <w:tab w:val="left" w:pos="3664"/>
+          <w:tab w:val="left" w:pos="4580"/>
+          <w:tab w:val="left" w:pos="5496"/>
+          <w:tab w:val="left" w:pos="6412"/>
+          <w:tab w:val="left" w:pos="7328"/>
+          <w:tab w:val="left" w:pos="8244"/>
+          <w:tab w:val="left" w:pos="9160"/>
+          <w:tab w:val="left" w:pos="10076"/>
+          <w:tab w:val="left" w:pos="10992"/>
+          <w:tab w:val="left" w:pos="11908"/>
+          <w:tab w:val="left" w:pos="12824"/>
+          <w:tab w:val="left" w:pos="13740"/>
+          <w:tab w:val="left" w:pos="14656"/>
+        </w:tabs>
+        <w:spacing w:after="0" w:line="240" w:lineRule="auto"/>
+        <w:rPr>
+          <w:rFonts w:ascii="Courier New" w:eastAsia="Times New Roman" w:hAnsi="Courier New" w:cs="Courier New"/>
+          <w:kern w:val="0"/>
+          <w:sz w:val="20"/>
+          <w:szCs w:val="20"/>
+          <w14:ligatures w14:val="none"/>
+        </w:rPr>
+      </w:pPr>
+      <w:proofErr w:type="spellStart"/>
+      <w:r>
+        <w:rPr>
+          <w:rFonts w:ascii="Courier New" w:eastAsia="Times New Roman" w:hAnsi="Courier New" w:cs="Courier New"/>
+          <w:kern w:val="0"/>
+          <w:sz w:val="20"/>
+          <w:szCs w:val="20"/>
+          <w14:ligatures w14:val="none"/>
+        </w:rPr>
+        <w:t>url_dataset</w:t>
+      </w:r>
+      <w:proofErr w:type="spellEnd"/>
+      <w:r>
+        <w:rPr>
+          <w:rFonts w:ascii="Courier New" w:eastAsia="Times New Roman" w:hAnsi="Courier New" w:cs="Courier New"/>
+          <w:kern w:val="0"/>
+          <w:sz w:val="20"/>
+          <w:szCs w:val="20"/>
+          <w14:ligatures w14:val="none"/>
+        </w:rPr>
+        <w:t>: ""</w:t>
+      </w:r>
+    </w:p>
+    <w:p>
+      <w:pPr>
+        <w:tabs>
+          <w:tab w:val="left" w:pos="916"/>
+          <w:tab w:val="left" w:pos="1832"/>
+          <w:tab w:val="left" w:pos="2748"/>
+          <w:tab w:val="left" w:pos="3664"/>
+          <w:tab w:val="left" w:pos="4580"/>
+          <w:tab w:val="left" w:pos="5496"/>
+          <w:tab w:val="left" w:pos="6412"/>
+          <w:tab w:val="left" w:pos="7328"/>
+          <w:tab w:val="left" w:pos="8244"/>
+          <w:tab w:val="left" w:pos="9160"/>
+          <w:tab w:val="left" w:pos="10076"/>
+          <w:tab w:val="left" w:pos="10992"/>
+          <w:tab w:val="left" w:pos="11908"/>
+          <w:tab w:val="left" w:pos="12824"/>
+          <w:tab w:val="left" w:pos="13740"/>
+          <w:tab w:val="left" w:pos="14656"/>
+        </w:tabs>
+        <w:spacing w:after="0" w:line="240" w:lineRule="auto"/>
+        <w:rPr>
+          <w:rFonts w:ascii="Courier New" w:eastAsia="Times New Roman" w:hAnsi="Courier New" w:cs="Courier New"/>
+          <w:kern w:val="0"/>
+          <w:sz w:val="20"/>
+          <w:szCs w:val="20"/>
+          <w14:ligatures w14:val="none"/>
+        </w:rPr>
+      </w:pPr>
+      <w:proofErr w:type="spellStart"/>
+      <w:r>
+        <w:rPr>
+          <w:rFonts w:ascii="Courier New" w:eastAsia="Times New Roman" w:hAnsi="Courier New" w:cs="Courier New"/>
+          <w:kern w:val="0"/>
+          <w:sz w:val="20"/>
+          <w:szCs w:val="20"/>
+          <w14:ligatures w14:val="none"/>
+        </w:rPr>
+        <w:t>url_poster</w:t>
+      </w:r>
+      <w:proofErr w:type="spellEnd"/>
+      <w:r>
+        <w:rPr>
+          <w:rFonts w:ascii="Courier New" w:eastAsia="Times New Roman" w:hAnsi="Courier New" w:cs="Courier New"/>
+          <w:kern w:val="0"/>
+          <w:sz w:val="20"/>
+          <w:szCs w:val="20"/>
+          <w14:ligatures w14:val="none"/>
+        </w:rPr>
+        <w:t>: ""</w:t>
+      </w:r>
+    </w:p>
+    <w:p>
+      <w:pPr>
+        <w:tabs>
+          <w:tab w:val="left" w:pos="916"/>
+          <w:tab w:val="left" w:pos="1832"/>
+          <w:tab w:val="left" w:pos="2748"/>
+          <w:tab w:val="left" w:pos="3664"/>
+          <w:tab w:val="left" w:pos="4580"/>
+          <w:tab w:val="left" w:pos="5496"/>
+          <w:tab w:val="left" w:pos="6412"/>
+          <w:tab w:val="left" w:pos="7328"/>
+          <w:tab w:val="left" w:pos="8244"/>
+          <w:tab w:val="left" w:pos="9160"/>
+          <w:tab w:val="left" w:pos="10076"/>
+          <w:tab w:val="left" w:pos="10992"/>
+          <w:tab w:val="left" w:pos="11908"/>
+          <w:tab w:val="left" w:pos="12824"/>
+          <w:tab w:val="left" w:pos="13740"/>
+          <w:tab w:val="left" w:pos="14656"/>
+        </w:tabs>
+        <w:spacing w:after="0" w:line="240" w:lineRule="auto"/>
+        <w:rPr>
+          <w:rFonts w:ascii="Courier New" w:eastAsia="Times New Roman" w:hAnsi="Courier New" w:cs="Courier New"/>
+          <w:kern w:val="0"/>
+          <w:sz w:val="20"/>
+          <w:szCs w:val="20"/>
+          <w14:ligatures w14:val="none"/>
+        </w:rPr>
+      </w:pPr>
+      <w:proofErr w:type="spellStart"/>
+      <w:r>
+        <w:rPr>
+          <w:rFonts w:ascii="Courier New" w:eastAsia="Times New Roman" w:hAnsi="Courier New" w:cs="Courier New"/>
+          <w:kern w:val="0"/>
+          <w:sz w:val="20"/>
+          <w:szCs w:val="20"/>
+          <w14:ligatures w14:val="none"/>
+        </w:rPr>
+        <w:t>url_slides</w:t>
+      </w:r>
+      <w:proofErr w:type="spellEnd"/>
+      <w:r>
+        <w:rPr>
+          <w:rFonts w:ascii="Courier New" w:eastAsia="Times New Roman" w:hAnsi="Courier New" w:cs="Courier New"/>
+          <w:kern w:val="0"/>
+          <w:sz w:val="20"/>
+          <w:szCs w:val="20"/>
+          <w14:ligatures w14:val="none"/>
+        </w:rPr>
+        <w:t>: ""</w:t>
+      </w:r>
+    </w:p>
+    <w:p>
+      <w:pPr>
+        <w:tabs>
+          <w:tab w:val="left" w:pos="916"/>
+          <w:tab w:val="left" w:pos="1832"/>
+          <w:tab w:val="left" w:pos="2748"/>
+          <w:tab w:val="left" w:pos="3664"/>
+          <w:tab w:val="left" w:pos="4580"/>
+          <w:tab w:val="left" w:pos="5496"/>
+          <w:tab w:val="left" w:pos="6412"/>
+          <w:tab w:val="left" w:pos="7328"/>
+          <w:tab w:val="left" w:pos="8244"/>
+          <w:tab w:val="left" w:pos="9160"/>
+          <w:tab w:val="left" w:pos="10076"/>
+          <w:tab w:val="left" w:pos="10992"/>
+          <w:tab w:val="left" w:pos="11908"/>
+          <w:tab w:val="left" w:pos="12824"/>
+          <w:tab w:val="left" w:pos="13740"/>
+          <w:tab w:val="left" w:pos="14656"/>
+        </w:tabs>
+        <w:spacing w:after="0" w:line="240" w:lineRule="auto"/>
+        <w:rPr>
+          <w:rFonts w:ascii="Courier New" w:eastAsia="Times New Roman" w:hAnsi="Courier New" w:cs="Courier New"/>
+          <w:kern w:val="0"/>
+          <w:sz w:val="20"/>
+          <w:szCs w:val="20"/>
+          <w14:ligatures w14:val="none"/>
+        </w:rPr>
+      </w:pPr>
+      <w:proofErr w:type="spellStart"/>
+      <w:r>
+        <w:rPr>
+          <w:rFonts w:ascii="Courier New" w:eastAsia="Times New Roman" w:hAnsi="Courier New" w:cs="Courier New"/>
+          <w:kern w:val="0"/>
+          <w:sz w:val="20"/>
+          <w:szCs w:val="20"/>
+          <w14:ligatures w14:val="none"/>
+        </w:rPr>
+        <w:t>url_source</w:t>
+      </w:r>
+      <w:proofErr w:type="spellEnd"/>
+      <w:r>
+        <w:rPr>
+          <w:rFonts w:ascii="Courier New" w:eastAsia="Times New Roman" w:hAnsi="Courier New" w:cs="Courier New"/>
+          <w:kern w:val="0"/>
+          <w:sz w:val="20"/>
+          <w:szCs w:val="20"/>
+          <w14:ligatures w14:val="none"/>
+        </w:rPr>
+        <w:t>: ""</w:t>
+      </w:r>
+    </w:p>
+    <w:p>
+      <w:pPr>
+        <w:tabs>
+          <w:tab w:val="left" w:pos="916"/>
+          <w:tab w:val="left" w:pos="1832"/>
+          <w:tab w:val="left" w:pos="2748"/>
+          <w:tab w:val="left" w:pos="3664"/>
+          <w:tab w:val="left" w:pos="4580"/>
+          <w:tab w:val="left" w:pos="5496"/>
+          <w:tab w:val="left" w:pos="6412"/>
+          <w:tab w:val="left" w:pos="7328"/>
+          <w:tab w:val="left" w:pos="8244"/>
+          <w:tab w:val="left" w:pos="9160"/>
+          <w:tab w:val="left" w:pos="10076"/>
+          <w:tab w:val="left" w:pos="10992"/>
+          <w:tab w:val="left" w:pos="11908"/>
+          <w:tab w:val="left" w:pos="12824"/>
+          <w:tab w:val="left" w:pos="13740"/>
+          <w:tab w:val="left" w:pos="14656"/>
+        </w:tabs>
+        <w:spacing w:after="0" w:line="240" w:lineRule="auto"/>
+        <w:rPr>
+          <w:rFonts w:ascii="Courier New" w:eastAsia="Times New Roman" w:hAnsi="Courier New" w:cs="Courier New"/>
+          <w:kern w:val="0"/>
+          <w:sz w:val="20"/>
+          <w:szCs w:val="20"/>
+          <w14:ligatures w14:val="none"/>
+        </w:rPr>
+      </w:pPr>
+      <w:proofErr w:type="spellStart"/>
+      <w:r>
+        <w:rPr>
+          <w:rFonts w:ascii="Courier New" w:eastAsia="Times New Roman" w:hAnsi="Courier New" w:cs="Courier New"/>
+          <w:kern w:val="0"/>
+          <w:sz w:val="20"/>
+          <w:szCs w:val="20"/>
+          <w14:ligatures w14:val="none"/>
+        </w:rPr>
+        <w:t>url_video</w:t>
+      </w:r>
+      <w:proofErr w:type="spellEnd"/>
+      <w:r>
+        <w:rPr>
+          <w:rFonts w:ascii="Courier New" w:eastAsia="Times New Roman" w:hAnsi="Courier New" w:cs="Courier New"/>
+          <w:kern w:val="0"/>
+          <w:sz w:val="20"/>
+          <w:szCs w:val="20"/>
+          <w14:ligatures w14:val="none"/>
+        </w:rPr>
+        <w:t>: ""</w:t>
+      </w:r>
+    </w:p>
+    <w:p>
+      <w:pPr>
+        <w:tabs>
+          <w:tab w:val="left" w:pos="916"/>
+          <w:tab w:val="left" w:pos="1832"/>
+          <w:tab w:val="left" w:pos="2748"/>
+          <w:tab w:val="left" w:pos="3664"/>
+          <w:tab w:val="left" w:pos="4580"/>
+          <w:tab w:val="left" w:pos="5496"/>
+          <w:tab w:val="left" w:pos="6412"/>
+          <w:tab w:val="left" w:pos="7328"/>
+          <w:tab w:val="left" w:pos="8244"/>
+          <w:tab w:val="left" w:pos="9160"/>
+          <w:tab w:val="left" w:pos="10076"/>
+          <w:tab w:val="left" w:pos="10992"/>
+          <w:tab w:val="left" w:pos="11908"/>
+          <w:tab w:val="left" w:pos="12824"/>
+          <w:tab w:val="left" w:pos="13740"/>
+          <w:tab w:val="left" w:pos="14656"/>
+        </w:tabs>
+        <w:spacing w:after="0" w:line="240" w:lineRule="auto"/>
+        <w:rPr>
+          <w:rFonts w:ascii="Courier New" w:eastAsia="Times New Roman" w:hAnsi="Courier New" w:cs="Courier New"/>
+          <w:kern w:val="0"/>
+          <w:sz w:val="20"/>
+          <w:szCs w:val="20"/>
+          <w14:ligatures w14:val="none"/>
+        </w:rPr>
+      </w:pPr>
+    </w:p>
+    <w:p>
+      <w:pPr>
+        <w:tabs>
+          <w:tab w:val="left" w:pos="916"/>
+          <w:tab w:val="left" w:pos="1832"/>
+          <w:tab w:val="left" w:pos="2748"/>
+          <w:tab w:val="left" w:pos="3664"/>
+          <w:tab w:val="left" w:pos="4580"/>
+          <w:tab w:val="left" w:pos="5496"/>
+          <w:tab w:val="left" w:pos="6412"/>
+          <w:tab w:val="left" w:pos="7328"/>
+          <w:tab w:val="left" w:pos="8244"/>
+          <w:tab w:val="left" w:pos="9160"/>
+          <w:tab w:val="left" w:pos="10076"/>
+          <w:tab w:val="left" w:pos="10992"/>
+          <w:tab w:val="left" w:pos="11908"/>
+          <w:tab w:val="left" w:pos="12824"/>
+          <w:tab w:val="left" w:pos="13740"/>
+          <w:tab w:val="left" w:pos="14656"/>
+        </w:tabs>
+        <w:spacing w:after="0" w:line="240" w:lineRule="auto"/>
+        <w:rPr>
+          <w:rFonts w:ascii="Courier New" w:eastAsia="Times New Roman" w:hAnsi="Courier New" w:cs="Courier New"/>
+          <w:kern w:val="0"/>
+          <w:sz w:val="20"/>
+          <w:szCs w:val="20"/>
+          <w14:ligatures w14:val="none"/>
+        </w:rPr>
+      </w:pPr>
+      <w:r>
+        <w:rPr>
+          <w:rFonts w:ascii="Courier New" w:eastAsia="Times New Roman" w:hAnsi="Courier New" w:cs="Courier New"/>
+          <w:kern w:val="0"/>
+          <w:sz w:val="20"/>
+          <w:szCs w:val="20"/>
+          <w14:ligatures w14:val="none"/>
+        </w:rPr>
+        <w:t>featured: false</w:t>
+      </w:r>
+    </w:p>
+    <w:p>
+      <w:pPr>
+        <w:tabs>
+          <w:tab w:val="left" w:pos="916"/>
+          <w:tab w:val="left" w:pos="1832"/>
+          <w:tab w:val="left" w:pos="2748"/>
+          <w:tab w:val="left" w:pos="3664"/>
+          <w:tab w:val="left" w:pos="4580"/>
+          <w:tab w:val="left" w:pos="5496"/>
+          <w:tab w:val="left" w:pos="6412"/>
+          <w:tab w:val="left" w:pos="7328"/>
+          <w:tab w:val="left" w:pos="8244"/>
+          <w:tab w:val="left" w:pos="9160"/>
+          <w:tab w:val="left" w:pos="10076"/>
+          <w:tab w:val="left" w:pos="10992"/>
+          <w:tab w:val="left" w:pos="11908"/>
+          <w:tab w:val="left" w:pos="12824"/>
+          <w:tab w:val="left" w:pos="13740"/>
+          <w:tab w:val="left" w:pos="14656"/>
+        </w:tabs>
+        <w:spacing w:after="0" w:line="240" w:lineRule="auto"/>
+        <w:rPr>
+          <w:rFonts w:ascii="Courier New" w:eastAsia="Times New Roman" w:hAnsi="Courier New" w:cs="Courier New"/>
+          <w:kern w:val="0"/>
+          <w:sz w:val="20"/>
+          <w:szCs w:val="20"/>
+          <w14:ligatures w14:val="none"/>
+        </w:rPr>
+      </w:pPr>
+      <w:r>
+        <w:rPr>
+          <w:rFonts w:ascii="Courier New" w:eastAsia="Times New Roman" w:hAnsi="Courier New" w:cs="Courier New"/>
+          <w:kern w:val="0"/>
+          <w:sz w:val="20"/>
+          <w:szCs w:val="20"/>
+          <w14:ligatures w14:val="none"/>
+        </w:rPr>
+        <w:t>---</w:t>
+      </w:r>
+    </w:p>
+    <w:p>
+      <w:pPr>
+        <w:spacing w:before="100" w:beforeAutospacing="1" w:after="100" w:afterAutospacing="1" w:line="240" w:lineRule="auto"/>
+        <w:outlineLvl w:val="2"/>
+        <w:rPr>
+          <w:rFonts w:ascii="Times New Roman" w:eastAsia="Times New Roman" w:hAnsi="Times New Roman" w:cs="Times New Roman"/>
+          <w:b/>
+          <w:bCs/>
+          <w:color w:val="000000"/>
+          <w:kern w:val="0"/>
+          <w:sz w:val="27"/>
+          <w:szCs w:val="27"/>
+          <w14:ligatures w14:val="none"/>
+        </w:rPr>
+      </w:pPr>
+      <w:r>
+        <w:rPr>
+          <w:rFonts w:ascii="Times New Roman" w:eastAsia="Times New Roman" w:hAnsi="Times New Roman" w:cs="Times New Roman"/>
+          <w:b/>
+          <w:bCs/>
+          <w:color w:val="000000"/>
+          <w:kern w:val="0"/>
+          <w:sz w:val="27"/>
+          <w:szCs w:val="27"/>
+          <w14:ligatures w14:val="none"/>
+        </w:rPr>
+        <w:t>Step 5: Test and Deploy</w:t>
+      </w:r>
+    </w:p>
+    <w:p>
+      <w:pPr>
+        <w:numPr>
+          <w:ilvl w:val="0"/>
+          <w:numId w:val="3"/>
+        </w:numPr>
+        <w:spacing w:before="100" w:beforeAutospacing="1" w:after="100" w:afterAutospacing="1" w:line="240" w:lineRule="auto"/>
+        <w:rPr>
+          <w:rFonts w:ascii="Times New Roman" w:eastAsia="Times New Roman" w:hAnsi="Times New Roman" w:cs="Times New Roman"/>
+          <w:color w:val="000000"/>
+          <w:kern w:val="0"/>
+          <w14:ligatures w14:val="none"/>
+        </w:rPr>
+      </w:pPr>
+      <w:r>
+        <w:rPr>
+          <w:rFonts w:ascii="Times New Roman" w:eastAsia="Times New Roman" w:hAnsi="Times New Roman" w:cs="Times New Roman"/>
+          <w:color w:val="000000"/>
+          <w:kern w:val="0"/>
+          <w14:ligatures w14:val="none"/>
+        </w:rPr>
+        <w:t>Preview your new publication locally:</w:t>
+      </w:r>
+    </w:p>
+    <w:p>
+      <w:pPr>
+        <w:spacing w:beforeAutospacing="1" w:after="0" w:afterAutospacing="1" w:line="240" w:lineRule="auto"/>
         <w:ind w:left="720"/>
         <w:rPr>
+          <w:rFonts w:ascii="Times New Roman" w:eastAsia="Times New Roman" w:hAnsi="Times New Roman" w:cs="Times New Roman"/>
+          <w:color w:val="000000"/>
+          <w:kern w:val="0"/>
+          <w14:ligatures w14:val="none"/>
+        </w:rPr>
+      </w:pPr>
+      <w:r>
+        <w:rPr>
+          <w:rFonts w:ascii="Times New Roman" w:eastAsia="Times New Roman" w:hAnsi="Times New Roman" w:cs="Times New Roman"/>
+          <w:color w:val="000000"/>
+          <w:kern w:val="0"/>
+          <w14:ligatures w14:val="none"/>
+        </w:rPr>
+        <w:t>Bash</w:t>
+      </w:r>
+    </w:p>
+    <w:p>
+      <w:pPr>
+        <w:tabs>
+          <w:tab w:val="left" w:pos="916"/>
+          <w:tab w:val="left" w:pos="1832"/>
+          <w:tab w:val="left" w:pos="2748"/>
+          <w:tab w:val="left" w:pos="3664"/>
+          <w:tab w:val="left" w:pos="4580"/>
+          <w:tab w:val="left" w:pos="5496"/>
+          <w:tab w:val="left" w:pos="6412"/>
+          <w:tab w:val="left" w:pos="7328"/>
+          <w:tab w:val="left" w:pos="8244"/>
+          <w:tab w:val="left" w:pos="9160"/>
+          <w:tab w:val="left" w:pos="10076"/>
+          <w:tab w:val="left" w:pos="10992"/>
+          <w:tab w:val="left" w:pos="11908"/>
+          <w:tab w:val="left" w:pos="12824"/>
+          <w:tab w:val="left" w:pos="13740"/>
+          <w:tab w:val="left" w:pos="14656"/>
+        </w:tabs>
+        <w:spacing w:after="0" w:line="240" w:lineRule="auto"/>
+        <w:ind w:left="720"/>
+        <w:rPr>
+          <w:rFonts w:ascii="Courier New" w:eastAsia="Times New Roman" w:hAnsi="Courier New" w:cs="Courier New"/>
+          <w:color w:val="000000"/>
+          <w:kern w:val="0"/>
+          <w:sz w:val="20"/>
+          <w:szCs w:val="20"/>
+          <w14:ligatures w14:val="none"/>
+        </w:rPr>
+      </w:pPr>
+      <w:proofErr w:type="spellStart"/>
+      <w:r>
+        <w:rPr>
+          <w:rFonts w:ascii="Courier New" w:eastAsia="Times New Roman" w:hAnsi="Courier New" w:cs="Courier New"/>
+          <w:color w:val="000000"/>
+          <w:kern w:val="0"/>
+          <w:sz w:val="20"/>
+          <w:szCs w:val="20"/>
+          <w14:ligatures w14:val="none"/>
+        </w:rPr>
+        <w:t>hugo</w:t>
+      </w:r>
+      <w:proofErr w:type="spellEnd"/>
+      <w:r>
+        <w:rPr>
+          <w:rFonts w:ascii="Courier New" w:eastAsia="Times New Roman" w:hAnsi="Courier New" w:cs="Courier New"/>
+          <w:color w:val="000000"/>
+          <w:kern w:val="0"/>
+          <w:sz w:val="20"/>
+          <w:szCs w:val="20"/>
+          <w14:ligatures w14:val="none"/>
+        </w:rPr>
+        <w:t xml:space="preserve"> server -D --</w:t>
+      </w:r>
+      <w:proofErr w:type="spellStart"/>
+      <w:r>
+        <w:rPr>
+          <w:rFonts w:ascii="Courier New" w:eastAsia="Times New Roman" w:hAnsi="Courier New" w:cs="Courier New"/>
+          <w:color w:val="000000"/>
+          <w:kern w:val="0"/>
+          <w:sz w:val="20"/>
+          <w:szCs w:val="20"/>
+          <w14:ligatures w14:val="none"/>
+        </w:rPr>
+        <w:t>buildFuture</w:t>
+      </w:r>
+      <w:proofErr w:type="spellEnd"/>
+    </w:p>
+    <w:p>
+      <w:pPr>
+        <w:numPr>
+          <w:ilvl w:val="0"/>
+          <w:numId w:val="3"/>
+        </w:numPr>
+        <w:spacing w:before="100" w:beforeAutospacing="1" w:after="100" w:afterAutospacing="1" w:line="240" w:lineRule="auto"/>
+        <w:rPr>
+          <w:rFonts w:ascii="Times New Roman" w:eastAsia="Times New Roman" w:hAnsi="Times New Roman" w:cs="Times New Roman"/>
+          <w:color w:val="000000"/>
+          <w:kern w:val="0"/>
+          <w14:ligatures w14:val="none"/>
+        </w:rPr>
+      </w:pPr>
+      <w:r>
+        <w:rPr>
+          <w:rFonts w:ascii="Times New Roman" w:eastAsia="Times New Roman" w:hAnsi="Times New Roman" w:cs="Times New Roman"/>
+          <w:color w:val="000000"/>
+          <w:kern w:val="0"/>
+          <w14:ligatures w14:val="none"/>
+        </w:rPr>
+        <w:t>Push the changes to GitHub Pages:</w:t>
+      </w:r>
+    </w:p>
+    <w:p>
+      <w:pPr>
+        <w:spacing w:beforeAutospacing="1" w:after="0" w:afterAutospacing="1" w:line="240" w:lineRule="auto"/>
+        <w:ind w:left="720"/>
+        <w:rPr>
+          <w:rFonts w:ascii="Times New Roman" w:eastAsia="Times New Roman" w:hAnsi="Times New Roman" w:cs="Times New Roman"/>
+          <w:color w:val="000000"/>
+          <w:kern w:val="0"/>
+          <w14:ligatures w14:val="none"/>
+        </w:rPr>
+      </w:pPr>
+      <w:r>
+        <w:rPr>
+          <w:rFonts w:ascii="Times New Roman" w:eastAsia="Times New Roman" w:hAnsi="Times New Roman" w:cs="Times New Roman"/>
+          <w:color w:val="000000"/>
+          <w:kern w:val="0"/>
+          <w14:ligatures w14:val="none"/>
+        </w:rPr>
+        <w:t>Bash</w:t>
+      </w:r>
+    </w:p>
+    <w:p>
+      <w:pPr>
+        <w:tabs>
+          <w:tab w:val="left" w:pos="916"/>
+          <w:tab w:val="left" w:pos="1832"/>
+          <w:tab w:val="left" w:pos="2748"/>
+          <w:tab w:val="left" w:pos="3664"/>
+          <w:tab w:val="left" w:pos="4580"/>
+          <w:tab w:val="left" w:pos="5496"/>
+          <w:tab w:val="left" w:pos="6412"/>
+          <w:tab w:val="left" w:pos="7328"/>
+          <w:tab w:val="left" w:pos="8244"/>
+          <w:tab w:val="left" w:pos="9160"/>
+          <w:tab w:val="left" w:pos="10076"/>
+          <w:tab w:val="left" w:pos="10992"/>
+          <w:tab w:val="left" w:pos="11908"/>
+          <w:tab w:val="left" w:pos="12824"/>
+          <w:tab w:val="left" w:pos="13740"/>
+          <w:tab w:val="left" w:pos="14656"/>
+        </w:tabs>
+        <w:spacing w:after="0" w:line="240" w:lineRule="auto"/>
+        <w:ind w:left="720"/>
+        <w:rPr>
+          <w:rFonts w:ascii="Courier New" w:eastAsia="Times New Roman" w:hAnsi="Courier New" w:cs="Courier New"/>
+          <w:color w:val="000000"/>
+          <w:kern w:val="0"/>
+          <w:sz w:val="20"/>
+          <w:szCs w:val="20"/>
+          <w14:ligatures w14:val="none"/>
+        </w:rPr>
+      </w:pPr>
+      <w:r>
+        <w:rPr>
+          <w:rFonts w:ascii="Courier New" w:eastAsia="Times New Roman" w:hAnsi="Courier New" w:cs="Courier New"/>
+          <w:color w:val="000000"/>
+          <w:kern w:val="0"/>
+          <w:sz w:val="20"/>
+          <w:szCs w:val="20"/>
+          <w14:ligatures w14:val="none"/>
+        </w:rPr>
+        <w:t xml:space="preserve">git </w:t>
+      </w:r>
+      <w:proofErr w:type="gramStart"/>
+      <w:r>
+        <w:rPr>
+          <w:rFonts w:ascii="Courier New" w:eastAsia="Times New Roman" w:hAnsi="Courier New" w:cs="Courier New"/>
+          <w:color w:val="000000"/>
+          <w:kern w:val="0"/>
+          <w:sz w:val="20"/>
+          <w:szCs w:val="20"/>
+          <w14:ligatures w14:val="none"/>
+        </w:rPr>
+        <w:t>add .</w:t>
+      </w:r>
+      <w:proofErr w:type="gramEnd"/>
+    </w:p>
+    <w:p>
+      <w:pPr>
+        <w:tabs>
+          <w:tab w:val="left" w:pos="916"/>
+          <w:tab w:val="left" w:pos="1832"/>
+          <w:tab w:val="left" w:pos="2748"/>
+          <w:tab w:val="left" w:pos="3664"/>
+          <w:tab w:val="left" w:pos="4580"/>
+          <w:tab w:val="left" w:pos="5496"/>
+          <w:tab w:val="left" w:pos="6412"/>
+          <w:tab w:val="left" w:pos="7328"/>
+          <w:tab w:val="left" w:pos="8244"/>
+          <w:tab w:val="left" w:pos="9160"/>
+          <w:tab w:val="left" w:pos="10076"/>
+          <w:tab w:val="left" w:pos="10992"/>
+          <w:tab w:val="left" w:pos="11908"/>
+          <w:tab w:val="left" w:pos="12824"/>
+          <w:tab w:val="left" w:pos="13740"/>
+          <w:tab w:val="left" w:pos="14656"/>
+        </w:tabs>
+        <w:spacing w:after="0" w:line="240" w:lineRule="auto"/>
+        <w:ind w:left="720"/>
+        <w:rPr>
+          <w:rFonts w:ascii="Courier New" w:eastAsia="Times New Roman" w:hAnsi="Courier New" w:cs="Courier New"/>
+          <w:color w:val="000000"/>
+          <w:kern w:val="0"/>
+          <w:sz w:val="20"/>
+          <w:szCs w:val="20"/>
+          <w14:ligatures w14:val="none"/>
+        </w:rPr>
+      </w:pPr>
+      <w:r>
+        <w:rPr>
+          <w:rFonts w:ascii="Courier New" w:eastAsia="Times New Roman" w:hAnsi="Courier New" w:cs="Courier New"/>
+          <w:color w:val="000000"/>
+          <w:kern w:val="0"/>
+          <w:sz w:val="20"/>
+          <w:szCs w:val="20"/>
+          <w14:ligatures w14:val="none"/>
+        </w:rPr>
+        <w:t>git commit -m "Add new publication: Smith 2026"</w:t>
+      </w:r>
+    </w:p>
+    <w:p>
+      <w:pPr>
+        <w:tabs>
+          <w:tab w:val="left" w:pos="916"/>
+          <w:tab w:val="left" w:pos="1832"/>
+          <w:tab w:val="left" w:pos="2748"/>
+          <w:tab w:val="left" w:pos="3664"/>
+          <w:tab w:val="left" w:pos="4580"/>
+          <w:tab w:val="left" w:pos="5496"/>
+          <w:tab w:val="left" w:pos="6412"/>
+          <w:tab w:val="left" w:pos="7328"/>
+          <w:tab w:val="left" w:pos="8244"/>
+          <w:tab w:val="left" w:pos="9160"/>
+          <w:tab w:val="left" w:pos="10076"/>
+          <w:tab w:val="left" w:pos="10992"/>
+          <w:tab w:val="left" w:pos="11908"/>
+          <w:tab w:val="left" w:pos="12824"/>
+          <w:tab w:val="left" w:pos="13740"/>
+          <w:tab w:val="left" w:pos="14656"/>
+        </w:tabs>
+        <w:spacing w:after="0" w:line="240" w:lineRule="auto"/>
+        <w:ind w:left="720"/>
+        <w:rPr>
           <w:rFonts w:ascii="Courier New" w:eastAsia="Times New Roman" w:hAnsi="Courier New" w:cs="Courier New"/>
           <w:color w:val="000000"/>
           <w:kern w:val="0"/>
@@ -3016,6 +3633,163 @@
         <w:t>git push origin main</w:t>
       </w:r>
     </w:p>
+    <w:p/>
+    <w:p>
+      <w:pPr>
+        <w:spacing w:before="100" w:beforeAutospacing="1" w:after="100" w:afterAutospacing="1" w:line="240" w:lineRule="auto"/>
+        <w:outlineLvl w:val="2"/>
+        <w:rPr>
+          <w:rFonts w:ascii="Times New Roman" w:eastAsia="Times New Roman" w:hAnsi="Times New Roman" w:cs="Times New Roman"/>
+          <w:b/>
+          <w:bCs/>
+          <w:color w:val="000000"/>
+          <w:kern w:val="0"/>
+          <w:sz w:val="27"/>
+          <w:szCs w:val="27"/>
+          <w14:ligatures w14:val="none"/>
+        </w:rPr>
+      </w:pPr>
+      <w:r>
+        <w:rPr>
+          <w:rFonts w:ascii="Times New Roman" w:eastAsia="Times New Roman" w:hAnsi="Times New Roman" w:cs="Times New Roman"/>
+          <w:b/>
+          <w:bCs/>
+          <w:color w:val="000000"/>
+          <w:kern w:val="0"/>
+          <w:sz w:val="27"/>
+          <w:szCs w:val="27"/>
+          <w14:ligatures w14:val="none"/>
+        </w:rPr>
+        <w:lastRenderedPageBreak/>
+        <w:t xml:space="preserve">Step </w:t>
+      </w:r>
+      <w:r>
+        <w:rPr>
+          <w:rFonts w:ascii="Times New Roman" w:eastAsia="Times New Roman" w:hAnsi="Times New Roman" w:cs="Times New Roman"/>
+          <w:b/>
+          <w:bCs/>
+          <w:color w:val="000000"/>
+          <w:kern w:val="0"/>
+          <w:sz w:val="27"/>
+          <w:szCs w:val="27"/>
+          <w14:ligatures w14:val="none"/>
+        </w:rPr>
+        <w:t>6</w:t>
+      </w:r>
+      <w:r>
+        <w:rPr>
+          <w:rFonts w:ascii="Times New Roman" w:eastAsia="Times New Roman" w:hAnsi="Times New Roman" w:cs="Times New Roman"/>
+          <w:b/>
+          <w:bCs/>
+          <w:color w:val="000000"/>
+          <w:kern w:val="0"/>
+          <w:sz w:val="27"/>
+          <w:szCs w:val="27"/>
+          <w14:ligatures w14:val="none"/>
+        </w:rPr>
+        <w:t xml:space="preserve">: </w:t>
+      </w:r>
+      <w:r>
+        <w:rPr>
+          <w:rFonts w:ascii="Times New Roman" w:eastAsia="Times New Roman" w:hAnsi="Times New Roman" w:cs="Times New Roman"/>
+          <w:b/>
+          <w:bCs/>
+          <w:color w:val="000000"/>
+          <w:kern w:val="0"/>
+          <w:sz w:val="27"/>
+          <w:szCs w:val="27"/>
+          <w14:ligatures w14:val="none"/>
+        </w:rPr>
+        <w:t>Increase the paper type counter</w:t>
+      </w:r>
+    </w:p>
+    <w:p>
+      <w:pPr>
+        <w:spacing w:before="100" w:beforeAutospacing="1" w:after="100" w:afterAutospacing="1" w:line="240" w:lineRule="auto"/>
+        <w:outlineLvl w:val="2"/>
+        <w:rPr>
+          <w:rFonts w:ascii="Times New Roman" w:eastAsia="Times New Roman" w:hAnsi="Times New Roman" w:cs="Times New Roman"/>
+          <w:color w:val="000000"/>
+          <w:kern w:val="0"/>
+          <w:sz w:val="27"/>
+          <w:szCs w:val="27"/>
+          <w14:ligatures w14:val="none"/>
+        </w:rPr>
+      </w:pPr>
+      <w:r>
+        <w:rPr>
+          <w:rFonts w:ascii="Times New Roman" w:eastAsia="Times New Roman" w:hAnsi="Times New Roman" w:cs="Times New Roman"/>
+          <w:color w:val="000000"/>
+          <w:kern w:val="0"/>
+          <w:sz w:val="27"/>
+          <w:szCs w:val="27"/>
+          <w14:ligatures w14:val="none"/>
+        </w:rPr>
+        <w:t>Go to</w:t>
+      </w:r>
+    </w:p>
+    <w:p>
+      <w:pPr>
+        <w:spacing w:before="100" w:beforeAutospacing="1" w:after="100" w:afterAutospacing="1" w:line="240" w:lineRule="auto"/>
+        <w:outlineLvl w:val="2"/>
+        <w:rPr>
+          <w:rFonts w:ascii="Times New Roman" w:eastAsia="Times New Roman" w:hAnsi="Times New Roman" w:cs="Times New Roman"/>
+          <w:color w:val="000000"/>
+          <w:kern w:val="0"/>
+          <w:sz w:val="27"/>
+          <w:szCs w:val="27"/>
+          <w14:ligatures w14:val="none"/>
+        </w:rPr>
+      </w:pPr>
+      <w:r>
+        <w:rPr>
+          <w:rFonts w:ascii="Times New Roman" w:eastAsia="Times New Roman" w:hAnsi="Times New Roman" w:cs="Times New Roman"/>
+          <w:color w:val="000000"/>
+          <w:kern w:val="0"/>
+          <w:sz w:val="27"/>
+          <w:szCs w:val="27"/>
+          <w14:ligatures w14:val="none"/>
+        </w:rPr>
+        <w:t>HORC-Lab.github.io/layouts/section/publication.html</w:t>
+      </w:r>
+      <w:r>
+        <w:rPr>
+          <w:rFonts w:ascii="Times New Roman" w:eastAsia="Times New Roman" w:hAnsi="Times New Roman" w:cs="Times New Roman"/>
+          <w:color w:val="000000"/>
+          <w:kern w:val="0"/>
+          <w:sz w:val="27"/>
+          <w:szCs w:val="27"/>
+          <w14:ligatures w14:val="none"/>
+        </w:rPr>
+        <w:t xml:space="preserve"> </w:t>
+      </w:r>
+    </w:p>
+    <w:p>
+      <w:pPr>
+        <w:spacing w:before="100" w:beforeAutospacing="1" w:after="100" w:afterAutospacing="1" w:line="240" w:lineRule="auto"/>
+        <w:outlineLvl w:val="2"/>
+        <w:rPr>
+          <w:rFonts w:ascii="Times New Roman" w:eastAsia="Times New Roman" w:hAnsi="Times New Roman" w:cs="Times New Roman"/>
+          <w:color w:val="000000"/>
+          <w:kern w:val="0"/>
+          <w:sz w:val="27"/>
+          <w:szCs w:val="27"/>
+          <w14:ligatures w14:val="none"/>
+        </w:rPr>
+      </w:pPr>
+      <w:r>
+        <w:rPr>
+          <w:rFonts w:ascii="Times New Roman" w:eastAsia="Times New Roman" w:hAnsi="Times New Roman" w:cs="Times New Roman"/>
+          <w:color w:val="000000"/>
+          <w:kern w:val="0"/>
+          <w:sz w:val="27"/>
+          <w:szCs w:val="27"/>
+          <w14:ligatures w14:val="none"/>
+        </w:rPr>
+        <w:t>Change line 18 to account for the new count of papers</w:t>
+      </w:r>
+    </w:p>
+    <w:p/>
     <w:p/>
     <w:p>
       <w:r>
@@ -3312,7 +4086,6 @@
           <w:szCs w:val="27"/>
           <w14:ligatures w14:val="none"/>
         </w:rPr>
-        <w:lastRenderedPageBreak/>
         <w:t>Why You Should Still Update It</w:t>
       </w:r>
     </w:p>
@@ -3480,7 +4253,7 @@
 </file>
 
 <file path=word/numbering.xml><?xml version="1.0" encoding="utf-8"?>
-<w:numbering xmlns:wpc="http://schemas.microsoft.com/office/word/2010/wordprocessingCanvas" xmlns:cx="http://schemas.microsoft.com/office/drawing/2014/chartex" xmlns:cx1="http://schemas.microsoft.com/office/drawing/2015/9/8/chartex" xmlns:cx2="http://schemas.microsoft.com/office/drawing/2015/10/21/chartex" xmlns:cx3="http://schemas.microsoft.com/office/drawing/2016/5/9/chartex" xmlns:cx4="http://schemas.microsoft.com/office/drawing/2016/5/10/chartex" xmlns:cx5="http://schemas.microsoft.com/office/drawing/2016/5/11/chartex" xmlns:cx6="http://schemas.microsoft.com/office/drawing/2016/5/12/chartex" xmlns:cx7="http://schemas.microsoft.com/office/drawing/2016/5/13/chartex" xmlns:cx8="http://schemas.microsoft.com/office/drawing/2016/5/14/chartex" xmlns:mc="http://schemas.openxmlformats.org/markup-compatibility/2006" xmlns:m="http://schemas.openxmlformats.org/officeDocument/2006/math" xmlns:aink="http://schemas.microsoft.com/office/drawing/2016/ink" xmlns:am3d="http://schemas.microsoft.com/office/drawing/2017/model3d" xmlns:oel="http://schemas.microsoft.com/office/2019/extlst" xmlns:r="http://schemas.openxmlformats.org/officeDocument/2006/relationships" xmlns:wp14="http://schemas.microsoft.com/office/word/2010/wordprocessingDrawing" xmlns:wp="http://schemas.openxmlformats.org/drawingml/2006/wordprocessingDrawing" xmlns:wpg="http://schemas.microsoft.com/office/word/2010/wordprocessingGroup" xmlns:wpi="http://schemas.microsoft.com/office/word/2010/wordprocessingInk" xmlns:wps="http://schemas.microsoft.com/office/word/2010/wordprocessingShape" xmlns:o="urn:schemas-microsoft-com:office:office" xmlns:v="urn:schemas-microsoft-com:vml" xmlns:w10="urn:schemas-microsoft-com:office:word" xmlns:w="http://schemas.openxmlformats.org/wordprocessingml/2006/main" xmlns:w14="http://schemas.microsoft.com/office/word/2010/wordml" xmlns:w15="http://schemas.microsoft.com/office/word/2012/wordml" xmlns:w16cei="http://schemas.microsoft.com/office/word/2026/wordml/cei" xmlns:w16cex="http://schemas.microsoft.com/office/word/2018/wordml/cex" xmlns:w16cid="http://schemas.microsoft.com/office/word/2016/wordml/cid" xmlns:w16="http://schemas.microsoft.com/office/word/2018/wordml" xmlns:w16sdtdh="http://schemas.microsoft.com/office/word/2020/wordml/sdtdatahash" xmlns:w16sdtfl="http://schemas.microsoft.com/office/word/2024/wordml/sdtformatlock" xmlns:w16se="http://schemas.microsoft.com/office/word/2015/wordml/symex" xmlns:w16du="http://schemas.microsoft.com/office/word/2023/wordml/word16du" xmlns:wne="http://schemas.microsoft.com/office/word/2006/wordml" mc:Ignorable="w14 w15 w16se w16cid w16 w16cex w16sdtdh w16sdtfl w16du wp14">
+<w:numbering xmlns:wpc="http://schemas.microsoft.com/office/word/2010/wordprocessingCanvas" xmlns:cx="http://schemas.microsoft.com/office/drawing/2014/chartex" xmlns:cx1="http://schemas.microsoft.com/office/drawing/2015/9/8/chartex" xmlns:cx2="http://schemas.microsoft.com/office/drawing/2015/10/21/chartex" xmlns:cx3="http://schemas.microsoft.com/office/drawing/2016/5/9/chartex" xmlns:cx4="http://schemas.microsoft.com/office/drawing/2016/5/10/chartex" xmlns:cx5="http://schemas.microsoft.com/office/drawing/2016/5/11/chartex" xmlns:cx6="http://schemas.microsoft.com/office/drawing/2016/5/12/chartex" xmlns:cx7="http://schemas.microsoft.com/office/drawing/2016/5/13/chartex" xmlns:cx8="http://schemas.microsoft.com/office/drawing/2016/5/14/chartex" xmlns:mc="http://schemas.openxmlformats.org/markup-compatibility/2006" xmlns:m="http://schemas.openxmlformats.org/officeDocument/2006/math" xmlns:aink="http://schemas.microsoft.com/office/drawing/2016/ink" xmlns:am3d="http://schemas.microsoft.com/office/drawing/2017/model3d" xmlns:oel="http://schemas.microsoft.com/office/2019/extlst" xmlns:r="http://schemas.openxmlformats.org/officeDocument/2006/relationships" xmlns:wp14="http://schemas.microsoft.com/office/word/2010/wordprocessingDrawing" xmlns:wp="http://schemas.openxmlformats.org/drawingml/2006/wordprocessingDrawing" xmlns:wpg="http://schemas.microsoft.com/office/word/2010/wordprocessingGroup" xmlns:wpi="http://schemas.microsoft.com/office/word/2010/wordprocessingInk" xmlns:wps="http://schemas.microsoft.com/office/word/2010/wordprocessingShape" xmlns:o="urn:schemas-microsoft-com:office:office" xmlns:v="urn:schemas-microsoft-com:vml" xmlns:w10="urn:schemas-microsoft-com:office:word" xmlns:w="http://schemas.openxmlformats.org/wordprocessingml/2006/main" xmlns:w14="http://schemas.microsoft.com/office/word/2010/wordml" xmlns:w15="http://schemas.microsoft.com/office/word/2012/wordml" xmlns:w16cex="http://schemas.microsoft.com/office/word/2018/wordml/cex" xmlns:w16cid="http://schemas.microsoft.com/office/word/2016/wordml/cid" xmlns:w16="http://schemas.microsoft.com/office/word/2018/wordml" xmlns:w16sdtdh="http://schemas.microsoft.com/office/word/2020/wordml/sdtdatahash" xmlns:w16sdtfl="http://schemas.microsoft.com/office/word/2024/wordml/sdtformatlock" xmlns:w16se="http://schemas.microsoft.com/office/word/2015/wordml/symex" xmlns:w16du="http://schemas.microsoft.com/office/word/2023/wordml/word16du" xmlns:wne="http://schemas.microsoft.com/office/word/2006/wordml" mc:Ignorable="w14 w15 w16se w16cid w16 w16cex w16sdtdh w16sdtfl w16du wp14">
   <w:abstractNum w:abstractNumId="0" w15:restartNumberingAfterBreak="0">
     <w:nsid w:val="2B14583C"/>
     <w:multiLevelType w:val="multilevel"/>
@@ -4620,7 +5393,6 @@
   <w:style w:type="character" w:default="1" w:styleId="DefaultParagraphFont">
     <w:name w:val="Default Paragraph Font"/>
     <w:uiPriority w:val="1"/>
-    <w:semiHidden/>
     <w:unhideWhenUsed/>
   </w:style>
   <w:style w:type="table" w:default="1" w:styleId="TableNormal">

</xml_diff>

<commit_message>
new pdf for kumbhar26
</commit_message>
<xml_diff>
--- a/HowToAddNewPaper.docx
+++ b/HowToAddNewPaper.docx
@@ -2,6 +2,66 @@
 <file path=word/document.xml><?xml version="1.0" encoding="utf-8"?>
 <w:document xmlns:wpc="http://schemas.microsoft.com/office/word/2010/wordprocessingCanvas" xmlns:cx="http://schemas.microsoft.com/office/drawing/2014/chartex" xmlns:cx1="http://schemas.microsoft.com/office/drawing/2015/9/8/chartex" xmlns:cx2="http://schemas.microsoft.com/office/drawing/2015/10/21/chartex" xmlns:cx3="http://schemas.microsoft.com/office/drawing/2016/5/9/chartex" xmlns:cx4="http://schemas.microsoft.com/office/drawing/2016/5/10/chartex" xmlns:cx5="http://schemas.microsoft.com/office/drawing/2016/5/11/chartex" xmlns:cx6="http://schemas.microsoft.com/office/drawing/2016/5/12/chartex" xmlns:cx7="http://schemas.microsoft.com/office/drawing/2016/5/13/chartex" xmlns:cx8="http://schemas.microsoft.com/office/drawing/2016/5/14/chartex" xmlns:mc="http://schemas.openxmlformats.org/markup-compatibility/2006" xmlns:m="http://schemas.openxmlformats.org/officeDocument/2006/math" xmlns:aink="http://schemas.microsoft.com/office/drawing/2016/ink" xmlns:am3d="http://schemas.microsoft.com/office/drawing/2017/model3d" xmlns:oel="http://schemas.microsoft.com/office/2019/extlst" xmlns:r="http://schemas.openxmlformats.org/officeDocument/2006/relationships" xmlns:wp14="http://schemas.microsoft.com/office/word/2010/wordprocessingDrawing" xmlns:wp="http://schemas.openxmlformats.org/drawingml/2006/wordprocessingDrawing" xmlns:wpg="http://schemas.microsoft.com/office/word/2010/wordprocessingGroup" xmlns:wpi="http://schemas.microsoft.com/office/word/2010/wordprocessingInk" xmlns:wps="http://schemas.microsoft.com/office/word/2010/wordprocessingShape" xmlns:o="urn:schemas-microsoft-com:office:office" xmlns:v="urn:schemas-microsoft-com:vml" xmlns:w10="urn:schemas-microsoft-com:office:word" xmlns:w="http://schemas.openxmlformats.org/wordprocessingml/2006/main" xmlns:w14="http://schemas.microsoft.com/office/word/2010/wordml" xmlns:w15="http://schemas.microsoft.com/office/word/2012/wordml" xmlns:w16cex="http://schemas.microsoft.com/office/word/2018/wordml/cex" xmlns:w16cid="http://schemas.microsoft.com/office/word/2016/wordml/cid" xmlns:w16="http://schemas.microsoft.com/office/word/2018/wordml" xmlns:w16sdtdh="http://schemas.microsoft.com/office/word/2020/wordml/sdtdatahash" xmlns:w16sdtfl="http://schemas.microsoft.com/office/word/2024/wordml/sdtformatlock" xmlns:w16se="http://schemas.microsoft.com/office/word/2015/wordml/symex" xmlns:w16du="http://schemas.microsoft.com/office/word/2023/wordml/word16du" xmlns:wne="http://schemas.microsoft.com/office/word/2006/wordml" mc:Ignorable="w14 w15 w16se w16cid w16 w16cex w16sdtdh w16sdtfl w16du wp14">
   <w:body>
+    <w:p>
+      <w:pPr>
+        <w:spacing w:before="100" w:beforeAutospacing="1" w:after="100" w:afterAutospacing="1" w:line="240" w:lineRule="auto"/>
+        <w:outlineLvl w:val="2"/>
+        <w:rPr>
+          <w:rFonts w:ascii="Times New Roman" w:eastAsia="Times New Roman" w:hAnsi="Times New Roman" w:cs="Times New Roman"/>
+          <w:b/>
+          <w:bCs/>
+          <w:color w:val="000000"/>
+          <w:kern w:val="0"/>
+          <w:sz w:val="27"/>
+          <w:szCs w:val="27"/>
+          <w14:ligatures w14:val="none"/>
+        </w:rPr>
+      </w:pPr>
+      <w:r>
+        <w:rPr>
+          <w:rFonts w:ascii="Times New Roman" w:eastAsia="Times New Roman" w:hAnsi="Times New Roman" w:cs="Times New Roman"/>
+          <w:b/>
+          <w:bCs/>
+          <w:color w:val="000000"/>
+          <w:kern w:val="0"/>
+          <w:sz w:val="27"/>
+          <w:szCs w:val="27"/>
+          <w:highlight w:val="green"/>
+          <w14:ligatures w14:val="none"/>
+        </w:rPr>
+        <w:t xml:space="preserve">[Give pdf from Step 1 to AI to create the files and then put them in VS code and </w:t>
+      </w:r>
+      <w:proofErr w:type="spellStart"/>
+      <w:r>
+        <w:rPr>
+          <w:rFonts w:ascii="Times New Roman" w:eastAsia="Times New Roman" w:hAnsi="Times New Roman" w:cs="Times New Roman"/>
+          <w:b/>
+          <w:bCs/>
+          <w:color w:val="000000"/>
+          <w:kern w:val="0"/>
+          <w:sz w:val="27"/>
+          <w:szCs w:val="27"/>
+          <w:highlight w:val="green"/>
+          <w14:ligatures w14:val="none"/>
+        </w:rPr>
+        <w:t>github</w:t>
+      </w:r>
+      <w:proofErr w:type="spellEnd"/>
+      <w:r>
+        <w:rPr>
+          <w:rFonts w:ascii="Times New Roman" w:eastAsia="Times New Roman" w:hAnsi="Times New Roman" w:cs="Times New Roman"/>
+          <w:b/>
+          <w:bCs/>
+          <w:color w:val="000000"/>
+          <w:kern w:val="0"/>
+          <w:sz w:val="27"/>
+          <w:szCs w:val="27"/>
+          <w:highlight w:val="green"/>
+          <w14:ligatures w14:val="none"/>
+        </w:rPr>
+        <w:t>]</w:t>
+      </w:r>
+    </w:p>
     <w:p>
       <w:pPr>
         <w:spacing w:before="100" w:beforeAutospacing="1" w:after="100" w:afterAutospacing="1" w:line="240" w:lineRule="auto"/>
@@ -1528,6 +1588,7 @@
           <w:kern w:val="0"/>
           <w14:ligatures w14:val="none"/>
         </w:rPr>
+        <w:lastRenderedPageBreak/>
         <w:t>YAML</w:t>
       </w:r>
     </w:p>
@@ -1688,7 +1749,6 @@
           <w:szCs w:val="20"/>
           <w14:ligatures w14:val="none"/>
         </w:rPr>
-        <w:lastRenderedPageBreak/>
         <w:t xml:space="preserve">  - John Smith</w:t>
       </w:r>
     </w:p>
@@ -3303,6 +3363,7 @@
         <w:t>---</w:t>
       </w:r>
     </w:p>
+    <w:p/>
     <w:p>
       <w:pPr>
         <w:spacing w:before="100" w:beforeAutospacing="1" w:after="100" w:afterAutospacing="1" w:line="240" w:lineRule="auto"/>
@@ -3329,7 +3390,187 @@
           <w:szCs w:val="27"/>
           <w14:ligatures w14:val="none"/>
         </w:rPr>
-        <w:t>Step 5: Test and Deploy</w:t>
+        <w:t xml:space="preserve">Step </w:t>
+      </w:r>
+      <w:r>
+        <w:rPr>
+          <w:rFonts w:ascii="Times New Roman" w:eastAsia="Times New Roman" w:hAnsi="Times New Roman" w:cs="Times New Roman"/>
+          <w:b/>
+          <w:bCs/>
+          <w:color w:val="000000"/>
+          <w:kern w:val="0"/>
+          <w:sz w:val="27"/>
+          <w:szCs w:val="27"/>
+          <w14:ligatures w14:val="none"/>
+        </w:rPr>
+        <w:t>5</w:t>
+      </w:r>
+      <w:r>
+        <w:rPr>
+          <w:rFonts w:ascii="Times New Roman" w:eastAsia="Times New Roman" w:hAnsi="Times New Roman" w:cs="Times New Roman"/>
+          <w:b/>
+          <w:bCs/>
+          <w:color w:val="000000"/>
+          <w:kern w:val="0"/>
+          <w:sz w:val="27"/>
+          <w:szCs w:val="27"/>
+          <w14:ligatures w14:val="none"/>
+        </w:rPr>
+        <w:t xml:space="preserve">: </w:t>
+      </w:r>
+      <w:r>
+        <w:rPr>
+          <w:rFonts w:ascii="Times New Roman" w:eastAsia="Times New Roman" w:hAnsi="Times New Roman" w:cs="Times New Roman"/>
+          <w:b/>
+          <w:bCs/>
+          <w:color w:val="000000"/>
+          <w:kern w:val="0"/>
+          <w:sz w:val="27"/>
+          <w:szCs w:val="27"/>
+          <w14:ligatures w14:val="none"/>
+        </w:rPr>
+        <w:t>Increase the paper type counter</w:t>
+      </w:r>
+    </w:p>
+    <w:p>
+      <w:pPr>
+        <w:spacing w:before="100" w:beforeAutospacing="1" w:after="100" w:afterAutospacing="1" w:line="240" w:lineRule="auto"/>
+        <w:outlineLvl w:val="2"/>
+        <w:rPr>
+          <w:rFonts w:ascii="Times New Roman" w:eastAsia="Times New Roman" w:hAnsi="Times New Roman" w:cs="Times New Roman"/>
+          <w:color w:val="000000"/>
+          <w:kern w:val="0"/>
+          <w:sz w:val="27"/>
+          <w:szCs w:val="27"/>
+          <w14:ligatures w14:val="none"/>
+        </w:rPr>
+      </w:pPr>
+      <w:r>
+        <w:rPr>
+          <w:rFonts w:ascii="Times New Roman" w:eastAsia="Times New Roman" w:hAnsi="Times New Roman" w:cs="Times New Roman"/>
+          <w:color w:val="000000"/>
+          <w:kern w:val="0"/>
+          <w:sz w:val="27"/>
+          <w:szCs w:val="27"/>
+          <w14:ligatures w14:val="none"/>
+        </w:rPr>
+        <w:t>Go to</w:t>
+      </w:r>
+    </w:p>
+    <w:p>
+      <w:pPr>
+        <w:spacing w:before="100" w:beforeAutospacing="1" w:after="100" w:afterAutospacing="1" w:line="240" w:lineRule="auto"/>
+        <w:outlineLvl w:val="2"/>
+        <w:rPr>
+          <w:rFonts w:ascii="Times New Roman" w:eastAsia="Times New Roman" w:hAnsi="Times New Roman" w:cs="Times New Roman"/>
+          <w:color w:val="000000"/>
+          <w:kern w:val="0"/>
+          <w:sz w:val="27"/>
+          <w:szCs w:val="27"/>
+          <w14:ligatures w14:val="none"/>
+        </w:rPr>
+      </w:pPr>
+      <w:r>
+        <w:rPr>
+          <w:rFonts w:ascii="Times New Roman" w:eastAsia="Times New Roman" w:hAnsi="Times New Roman" w:cs="Times New Roman"/>
+          <w:color w:val="000000"/>
+          <w:kern w:val="0"/>
+          <w:sz w:val="27"/>
+          <w:szCs w:val="27"/>
+          <w14:ligatures w14:val="none"/>
+        </w:rPr>
+        <w:t>HORC-Lab.github.io/layouts/section/publication.html</w:t>
+      </w:r>
+      <w:r>
+        <w:rPr>
+          <w:rFonts w:ascii="Times New Roman" w:eastAsia="Times New Roman" w:hAnsi="Times New Roman" w:cs="Times New Roman"/>
+          <w:color w:val="000000"/>
+          <w:kern w:val="0"/>
+          <w:sz w:val="27"/>
+          <w:szCs w:val="27"/>
+          <w14:ligatures w14:val="none"/>
+        </w:rPr>
+        <w:t xml:space="preserve"> </w:t>
+      </w:r>
+    </w:p>
+    <w:p>
+      <w:pPr>
+        <w:spacing w:before="100" w:beforeAutospacing="1" w:after="100" w:afterAutospacing="1" w:line="240" w:lineRule="auto"/>
+        <w:outlineLvl w:val="2"/>
+        <w:rPr>
+          <w:rFonts w:ascii="Times New Roman" w:eastAsia="Times New Roman" w:hAnsi="Times New Roman" w:cs="Times New Roman"/>
+          <w:color w:val="000000"/>
+          <w:kern w:val="0"/>
+          <w:sz w:val="27"/>
+          <w:szCs w:val="27"/>
+          <w14:ligatures w14:val="none"/>
+        </w:rPr>
+      </w:pPr>
+      <w:r>
+        <w:rPr>
+          <w:rFonts w:ascii="Times New Roman" w:eastAsia="Times New Roman" w:hAnsi="Times New Roman" w:cs="Times New Roman"/>
+          <w:color w:val="000000"/>
+          <w:kern w:val="0"/>
+          <w:sz w:val="27"/>
+          <w:szCs w:val="27"/>
+          <w14:ligatures w14:val="none"/>
+        </w:rPr>
+        <w:t>Change line 18 to account for the new count of papers</w:t>
+      </w:r>
+    </w:p>
+    <w:p>
+      <w:pPr>
+        <w:spacing w:before="100" w:beforeAutospacing="1" w:after="100" w:afterAutospacing="1" w:line="240" w:lineRule="auto"/>
+        <w:outlineLvl w:val="2"/>
+        <w:rPr>
+          <w:rFonts w:ascii="Times New Roman" w:eastAsia="Times New Roman" w:hAnsi="Times New Roman" w:cs="Times New Roman"/>
+          <w:b/>
+          <w:bCs/>
+          <w:color w:val="000000"/>
+          <w:kern w:val="0"/>
+          <w:sz w:val="27"/>
+          <w:szCs w:val="27"/>
+          <w14:ligatures w14:val="none"/>
+        </w:rPr>
+      </w:pPr>
+      <w:r>
+        <w:rPr>
+          <w:rFonts w:ascii="Times New Roman" w:eastAsia="Times New Roman" w:hAnsi="Times New Roman" w:cs="Times New Roman"/>
+          <w:b/>
+          <w:bCs/>
+          <w:color w:val="000000"/>
+          <w:kern w:val="0"/>
+          <w:sz w:val="27"/>
+          <w:szCs w:val="27"/>
+          <w14:ligatures w14:val="none"/>
+        </w:rPr>
+        <w:t xml:space="preserve">Step </w:t>
+      </w:r>
+      <w:r>
+        <w:rPr>
+          <w:rFonts w:ascii="Times New Roman" w:eastAsia="Times New Roman" w:hAnsi="Times New Roman" w:cs="Times New Roman"/>
+          <w:b/>
+          <w:bCs/>
+          <w:color w:val="000000"/>
+          <w:kern w:val="0"/>
+          <w:sz w:val="27"/>
+          <w:szCs w:val="27"/>
+          <w14:ligatures w14:val="none"/>
+        </w:rPr>
+        <w:t>6</w:t>
+      </w:r>
+      <w:r>
+        <w:rPr>
+          <w:rFonts w:ascii="Times New Roman" w:eastAsia="Times New Roman" w:hAnsi="Times New Roman" w:cs="Times New Roman"/>
+          <w:b/>
+          <w:bCs/>
+          <w:color w:val="000000"/>
+          <w:kern w:val="0"/>
+          <w:sz w:val="27"/>
+          <w:szCs w:val="27"/>
+          <w14:ligatures w14:val="none"/>
+        </w:rPr>
+        <w:t>: Test and Deploy</w:t>
       </w:r>
     </w:p>
     <w:p>
@@ -3374,6 +3615,7 @@
           <w:kern w:val="0"/>
           <w14:ligatures w14:val="none"/>
         </w:rPr>
+        <w:lastRenderedPageBreak/>
         <w:t>Bash</w:t>
       </w:r>
     </w:p>
@@ -3631,162 +3873,6 @@
           <w14:ligatures w14:val="none"/>
         </w:rPr>
         <w:t>git push origin main</w:t>
-      </w:r>
-    </w:p>
-    <w:p/>
-    <w:p>
-      <w:pPr>
-        <w:spacing w:before="100" w:beforeAutospacing="1" w:after="100" w:afterAutospacing="1" w:line="240" w:lineRule="auto"/>
-        <w:outlineLvl w:val="2"/>
-        <w:rPr>
-          <w:rFonts w:ascii="Times New Roman" w:eastAsia="Times New Roman" w:hAnsi="Times New Roman" w:cs="Times New Roman"/>
-          <w:b/>
-          <w:bCs/>
-          <w:color w:val="000000"/>
-          <w:kern w:val="0"/>
-          <w:sz w:val="27"/>
-          <w:szCs w:val="27"/>
-          <w14:ligatures w14:val="none"/>
-        </w:rPr>
-      </w:pPr>
-      <w:r>
-        <w:rPr>
-          <w:rFonts w:ascii="Times New Roman" w:eastAsia="Times New Roman" w:hAnsi="Times New Roman" w:cs="Times New Roman"/>
-          <w:b/>
-          <w:bCs/>
-          <w:color w:val="000000"/>
-          <w:kern w:val="0"/>
-          <w:sz w:val="27"/>
-          <w:szCs w:val="27"/>
-          <w14:ligatures w14:val="none"/>
-        </w:rPr>
-        <w:lastRenderedPageBreak/>
-        <w:t xml:space="preserve">Step </w:t>
-      </w:r>
-      <w:r>
-        <w:rPr>
-          <w:rFonts w:ascii="Times New Roman" w:eastAsia="Times New Roman" w:hAnsi="Times New Roman" w:cs="Times New Roman"/>
-          <w:b/>
-          <w:bCs/>
-          <w:color w:val="000000"/>
-          <w:kern w:val="0"/>
-          <w:sz w:val="27"/>
-          <w:szCs w:val="27"/>
-          <w14:ligatures w14:val="none"/>
-        </w:rPr>
-        <w:t>6</w:t>
-      </w:r>
-      <w:r>
-        <w:rPr>
-          <w:rFonts w:ascii="Times New Roman" w:eastAsia="Times New Roman" w:hAnsi="Times New Roman" w:cs="Times New Roman"/>
-          <w:b/>
-          <w:bCs/>
-          <w:color w:val="000000"/>
-          <w:kern w:val="0"/>
-          <w:sz w:val="27"/>
-          <w:szCs w:val="27"/>
-          <w14:ligatures w14:val="none"/>
-        </w:rPr>
-        <w:t xml:space="preserve">: </w:t>
-      </w:r>
-      <w:r>
-        <w:rPr>
-          <w:rFonts w:ascii="Times New Roman" w:eastAsia="Times New Roman" w:hAnsi="Times New Roman" w:cs="Times New Roman"/>
-          <w:b/>
-          <w:bCs/>
-          <w:color w:val="000000"/>
-          <w:kern w:val="0"/>
-          <w:sz w:val="27"/>
-          <w:szCs w:val="27"/>
-          <w14:ligatures w14:val="none"/>
-        </w:rPr>
-        <w:t>Increase the paper type counter</w:t>
-      </w:r>
-    </w:p>
-    <w:p>
-      <w:pPr>
-        <w:spacing w:before="100" w:beforeAutospacing="1" w:after="100" w:afterAutospacing="1" w:line="240" w:lineRule="auto"/>
-        <w:outlineLvl w:val="2"/>
-        <w:rPr>
-          <w:rFonts w:ascii="Times New Roman" w:eastAsia="Times New Roman" w:hAnsi="Times New Roman" w:cs="Times New Roman"/>
-          <w:color w:val="000000"/>
-          <w:kern w:val="0"/>
-          <w:sz w:val="27"/>
-          <w:szCs w:val="27"/>
-          <w14:ligatures w14:val="none"/>
-        </w:rPr>
-      </w:pPr>
-      <w:r>
-        <w:rPr>
-          <w:rFonts w:ascii="Times New Roman" w:eastAsia="Times New Roman" w:hAnsi="Times New Roman" w:cs="Times New Roman"/>
-          <w:color w:val="000000"/>
-          <w:kern w:val="0"/>
-          <w:sz w:val="27"/>
-          <w:szCs w:val="27"/>
-          <w14:ligatures w14:val="none"/>
-        </w:rPr>
-        <w:t>Go to</w:t>
-      </w:r>
-    </w:p>
-    <w:p>
-      <w:pPr>
-        <w:spacing w:before="100" w:beforeAutospacing="1" w:after="100" w:afterAutospacing="1" w:line="240" w:lineRule="auto"/>
-        <w:outlineLvl w:val="2"/>
-        <w:rPr>
-          <w:rFonts w:ascii="Times New Roman" w:eastAsia="Times New Roman" w:hAnsi="Times New Roman" w:cs="Times New Roman"/>
-          <w:color w:val="000000"/>
-          <w:kern w:val="0"/>
-          <w:sz w:val="27"/>
-          <w:szCs w:val="27"/>
-          <w14:ligatures w14:val="none"/>
-        </w:rPr>
-      </w:pPr>
-      <w:r>
-        <w:rPr>
-          <w:rFonts w:ascii="Times New Roman" w:eastAsia="Times New Roman" w:hAnsi="Times New Roman" w:cs="Times New Roman"/>
-          <w:color w:val="000000"/>
-          <w:kern w:val="0"/>
-          <w:sz w:val="27"/>
-          <w:szCs w:val="27"/>
-          <w14:ligatures w14:val="none"/>
-        </w:rPr>
-        <w:t>HORC-Lab.github.io/layouts/section/publication.html</w:t>
-      </w:r>
-      <w:r>
-        <w:rPr>
-          <w:rFonts w:ascii="Times New Roman" w:eastAsia="Times New Roman" w:hAnsi="Times New Roman" w:cs="Times New Roman"/>
-          <w:color w:val="000000"/>
-          <w:kern w:val="0"/>
-          <w:sz w:val="27"/>
-          <w:szCs w:val="27"/>
-          <w14:ligatures w14:val="none"/>
-        </w:rPr>
-        <w:t xml:space="preserve"> </w:t>
-      </w:r>
-    </w:p>
-    <w:p>
-      <w:pPr>
-        <w:spacing w:before="100" w:beforeAutospacing="1" w:after="100" w:afterAutospacing="1" w:line="240" w:lineRule="auto"/>
-        <w:outlineLvl w:val="2"/>
-        <w:rPr>
-          <w:rFonts w:ascii="Times New Roman" w:eastAsia="Times New Roman" w:hAnsi="Times New Roman" w:cs="Times New Roman"/>
-          <w:color w:val="000000"/>
-          <w:kern w:val="0"/>
-          <w:sz w:val="27"/>
-          <w:szCs w:val="27"/>
-          <w14:ligatures w14:val="none"/>
-        </w:rPr>
-      </w:pPr>
-      <w:r>
-        <w:rPr>
-          <w:rFonts w:ascii="Times New Roman" w:eastAsia="Times New Roman" w:hAnsi="Times New Roman" w:cs="Times New Roman"/>
-          <w:color w:val="000000"/>
-          <w:kern w:val="0"/>
-          <w:sz w:val="27"/>
-          <w:szCs w:val="27"/>
-          <w14:ligatures w14:val="none"/>
-        </w:rPr>
-        <w:t>Change line 18 to account for the new count of papers</w:t>
       </w:r>
     </w:p>
     <w:p/>

</xml_diff>

<commit_message>
added hobbs2026investigating paper pdf and cite
</commit_message>
<xml_diff>
--- a/HowToAddNewPaper.docx
+++ b/HowToAddNewPaper.docx
@@ -29,37 +29,7 @@
           <w:highlight w:val="green"/>
           <w14:ligatures w14:val="none"/>
         </w:rPr>
-        <w:t xml:space="preserve">[Give pdf from Step 1 to AI to create the files and then put them in VS code and </w:t>
-      </w:r>
-      <w:proofErr w:type="spellStart"/>
-      <w:r>
-        <w:rPr>
-          <w:rFonts w:ascii="Times New Roman" w:eastAsia="Times New Roman" w:hAnsi="Times New Roman" w:cs="Times New Roman"/>
-          <w:b/>
-          <w:bCs/>
-          <w:color w:val="000000"/>
-          <w:kern w:val="0"/>
-          <w:sz w:val="27"/>
-          <w:szCs w:val="27"/>
-          <w:highlight w:val="green"/>
-          <w14:ligatures w14:val="none"/>
-        </w:rPr>
-        <w:t>github</w:t>
-      </w:r>
-      <w:proofErr w:type="spellEnd"/>
-      <w:r>
-        <w:rPr>
-          <w:rFonts w:ascii="Times New Roman" w:eastAsia="Times New Roman" w:hAnsi="Times New Roman" w:cs="Times New Roman"/>
-          <w:b/>
-          <w:bCs/>
-          <w:color w:val="000000"/>
-          <w:kern w:val="0"/>
-          <w:sz w:val="27"/>
-          <w:szCs w:val="27"/>
-          <w:highlight w:val="green"/>
-          <w14:ligatures w14:val="none"/>
-        </w:rPr>
-        <w:t>]</w:t>
+        <w:t>AI steps using Clause project New Paper on Webpage</w:t>
       </w:r>
     </w:p>
     <w:p>
@@ -379,6 +349,7 @@
           <w:kern w:val="0"/>
           <w:sz w:val="27"/>
           <w:szCs w:val="27"/>
+          <w:highlight w:val="green"/>
           <w14:ligatures w14:val="none"/>
         </w:rPr>
         <w:t>Step 3: Add </w:t>
@@ -393,6 +364,7 @@
           <w:kern w:val="0"/>
           <w:sz w:val="20"/>
           <w:szCs w:val="20"/>
+          <w:highlight w:val="green"/>
           <w14:ligatures w14:val="none"/>
         </w:rPr>
         <w:t>cite.bib</w:t>
@@ -1497,6 +1469,7 @@
           <w:kern w:val="0"/>
           <w:sz w:val="27"/>
           <w:szCs w:val="27"/>
+          <w:highlight w:val="green"/>
           <w14:ligatures w14:val="none"/>
         </w:rPr>
         <w:t>Step 4: Add </w:t>
@@ -1510,6 +1483,7 @@
           <w:kern w:val="0"/>
           <w:sz w:val="20"/>
           <w:szCs w:val="20"/>
+          <w:highlight w:val="green"/>
           <w14:ligatures w14:val="none"/>
         </w:rPr>
         <w:t>index.md</w:t>
@@ -1588,7 +1562,6 @@
           <w:kern w:val="0"/>
           <w14:ligatures w14:val="none"/>
         </w:rPr>
-        <w:lastRenderedPageBreak/>
         <w:t>YAML</w:t>
       </w:r>
     </w:p>
@@ -1629,6 +1602,7 @@
           <w:szCs w:val="20"/>
           <w14:ligatures w14:val="none"/>
         </w:rPr>
+        <w:lastRenderedPageBreak/>
         <w:t>---</w:t>
       </w:r>
     </w:p>
@@ -3479,18 +3453,7 @@
           <w:szCs w:val="27"/>
           <w14:ligatures w14:val="none"/>
         </w:rPr>
-        <w:t>HORC-Lab.github.io/layouts/section/publication.html</w:t>
-      </w:r>
-      <w:r>
-        <w:rPr>
-          <w:rFonts w:ascii="Times New Roman" w:eastAsia="Times New Roman" w:hAnsi="Times New Roman" w:cs="Times New Roman"/>
-          <w:color w:val="000000"/>
-          <w:kern w:val="0"/>
-          <w:sz w:val="27"/>
-          <w:szCs w:val="27"/>
-          <w14:ligatures w14:val="none"/>
-        </w:rPr>
-        <w:t xml:space="preserve"> </w:t>
+        <w:t xml:space="preserve">HORC-Lab.github.io/layouts/section/publication.html </w:t>
       </w:r>
     </w:p>
     <w:p>
@@ -4193,6 +4156,36 @@
           <w14:ligatures w14:val="none"/>
         </w:rPr>
         <w:t>Keeping </w:t>
+      </w:r>
+      <w:r>
+        <w:rPr>
+          <w:rFonts w:ascii="Times New Roman" w:eastAsia="Times New Roman" w:hAnsi="Times New Roman" w:cs="Times New Roman"/>
+          <w:color w:val="000000"/>
+          <w:kern w:val="0"/>
+          <w14:ligatures w14:val="none"/>
+        </w:rPr>
+        <w:t>/</w:t>
+      </w:r>
+      <w:r>
+        <w:t xml:space="preserve"> </w:t>
+      </w:r>
+      <w:r>
+        <w:rPr>
+          <w:rFonts w:ascii="Times New Roman" w:eastAsia="Times New Roman" w:hAnsi="Times New Roman" w:cs="Times New Roman"/>
+          <w:color w:val="000000"/>
+          <w:kern w:val="0"/>
+          <w14:ligatures w14:val="none"/>
+        </w:rPr>
+        <w:t>HORC-Lab.github</w:t>
+      </w:r>
+      <w:r>
+        <w:rPr>
+          <w:rFonts w:ascii="Times New Roman" w:eastAsia="Times New Roman" w:hAnsi="Times New Roman" w:cs="Times New Roman"/>
+          <w:color w:val="000000"/>
+          <w:kern w:val="0"/>
+          <w14:ligatures w14:val="none"/>
+        </w:rPr>
+        <w:t>.io/</w:t>
       </w:r>
       <w:proofErr w:type="spellStart"/>
       <w:r>
@@ -5479,6 +5472,7 @@
   <w:style w:type="character" w:default="1" w:styleId="DefaultParagraphFont">
     <w:name w:val="Default Paragraph Font"/>
     <w:uiPriority w:val="1"/>
+    <w:semiHidden/>
     <w:unhideWhenUsed/>
   </w:style>
   <w:style w:type="table" w:default="1" w:styleId="TableNormal">

</xml_diff>